<commit_message>
Atualização do hardware: substituição pelo microcontrolador Wemos Lolin D32 (ESP32) e Bateria LiPo 3.7V 600mAh com conector JST PH 2.0mm
</commit_message>
<xml_diff>
--- a/01_Submissao_CEP_Palmilha_PPC/04_Termo_de_Anuencia_Institucional_PPC.docx
+++ b/01_Submissao_CEP_Palmilha_PPC/04_Termo_de_Anuencia_Institucional_PPC.docx
@@ -58,16 +58,16 @@
         <w:jc w:val="both"/>
       </w:pPr>
       <w:r>
-        <w:t xml:space="preserve">Declaro para os devidos fins que o Serviço de Fisioterapia / Setor de Baropodometria da POLICLÍNICA PIQUET CARNEIRO (PPC) do COMPLEXO HUPE/UERJ, tem conhecimento e manifesta total concordância com a condução e realização da Pesquisa intitulada: </w:t>
+        <w:t xml:space="preserve">Declaro para os devidos fins que o Serviço de Fisioterapia / Setor de Baropodometria da POLICLÍNICA PIQUET CARNEIRO (PPC) do COMPLEXO HUPE/UERJ, tem pleno conhecimento e manifesta total concordância com a condução e realização da Pesquisa intitulada: </w:t>
       </w:r>
       <w:r>
         <w:rPr>
           <w:b/>
         </w:rPr>
-        <w:t xml:space="preserve">“Desenvolvimento e Validação de Palmilha Inteligente Instrumentada para Monitoramento de Pressão Plantar, Temperatura e Umidade: Prova de Conceito com Baropodometria na Policlínica Piquet Carneiro”, </w:t>
+        <w:t xml:space="preserve">“Arquitetura de baixo custo para monitoramento preventivo do pé diabético: calibração com baropodômetro e prova de conceito na Policlínica Piquet Carneiro”, </w:t>
       </w:r>
       <w:r>
-        <w:t>sendo responsáveis o(a) pesquisador(a) discente [Nome Completo do Aluno] (Mestrando) e o(a) docente [Nome Completo do Orientador] (Orientador/Pesquisador Responsável), não havendo qualquer oposição à sua realização. Ratifico a ciência de que o projeto só poderá iniciar as etapas de coleta de dados com seres humanos após a expressa avaliação e aprovação consubstanciada do Comitê de Ética em Pesquisa do Hospital Universitário Pedro Ernesto da Universidade do Estado do Rio de Janeiro (CEP/HUPE/UERJ).</w:t>
+        <w:t>sendo responsáveis o pesquisador discente Chrysthian Chrisley Tadeu Santos Silva (Mestrando) e a docente Prof.ª Dra. Rosa Maria Esteves Moreira da Costa (Orientadora/Pesquisadora Responsável), não havendo qualquer oposição à sua realização. Ratifico a ciência de que o projeto só poderá iniciar as etapas de coleta de dados com seres humanos após a expressa avaliação e aprovação consubstanciada do Comitê de Ética em Pesquisa do Hospital Universitário Pedro Ernesto da Universidade do Estado do Rio de Janeiro (CEP/HUPE/UERJ).</w:t>
       </w:r>
     </w:p>
     <w:p>
@@ -94,7 +94,7 @@
       <w:r>
         <w:t>(   ) ENTREVISTA       (   ) QUESTIONÁRIO       (   ) PRONTUÁRIO</w:t>
         <w:br/>
-        <w:t>( X ) OUTROS: Ensaio biomecânico comparativo através de plataforma baropodométrica e uso experimental temporário de palmilha inteligente com sensores de pressão, temperatura e umidade em 3 a 5 voluntários.</w:t>
+        <w:t>( X ) OUTROS: Avaliação biomecânica comparativa através de plataforma de baropodometria e uso experimental temporário de palmilha inteligente instrumentada (microcontrolador Wemos Lolin D32, sensores FSR 402, DHT22 e bateria LiPo 3.7V 600mAh) em 3 a 5 voluntários adultos com Diabetes Mellitus.</w:t>
       </w:r>
     </w:p>
     <w:p>
@@ -153,11 +153,11 @@
         <w:spacing w:before="40" w:after="120" w:line="276" w:lineRule="auto"/>
       </w:pPr>
       <w:r>
-        <w:t>Faculdade / Departamento / Programa: Faculdade de Ciências Médicas / Núcleo de Telessaúde e Saúde Digital (PPG em Telessaúde e Saúde Digital)</w:t>
+        <w:t>Faculdade / Departamento / Programa: Faculdade de Ciências Médicas / Núcleo de Telessaúde e Saúde Digital (Programa de Pós-Graduação em Telessaúde e Saúde Digital (PPGTSD))</w:t>
         <w:br/>
         <w:t>Nível: (   ) Graduação   (   ) Especialização   ( X ) Mestrado Profissional   (   ) Doutorado</w:t>
         <w:br/>
-        <w:t>Condição: ( X ) Aluno Regular: [Nome Completo do Aluno]    Matrícula: [Número de Matrícula]</w:t>
+        <w:t>Condição: ( X ) Aluno Regular: Chrysthian Chrisley Tadeu Santos Silva    Matrícula: [Número de Matrícula]</w:t>
       </w:r>
     </w:p>
     <w:p>
@@ -207,7 +207,7 @@
               </w:rPr>
               <w:t>_____________________________________</w:t>
               <w:br/>
-              <w:t>[Nome Completo do Aluno]</w:t>
+              <w:t>Chrysthian Chrisley Tadeu Santos Silva</w:t>
               <w:br/>
               <w:t>Pesquisador Discente (Mestrando)</w:t>
               <w:br/>
@@ -229,9 +229,9 @@
               </w:rPr>
               <w:t>_____________________________________</w:t>
               <w:br/>
-              <w:t>[Nome Completo do Orientador]</w:t>
+              <w:t>Prof.ª Dra. Rosa Maria Esteves Moreira da Costa</w:t>
               <w:br/>
-              <w:t>Pesquisador Responsável / Orientador</w:t>
+              <w:t>Pesquisadora Responsável / Orientadora</w:t>
               <w:br/>
               <w:t>Data: ___/___/2026</w:t>
             </w:r>

</xml_diff>

<commit_message>
feat: add institutional agreement document for CEP submission
</commit_message>
<xml_diff>
--- a/01_Submissao_CEP_Palmilha_PPC/04_Termo_de_Anuencia_Institucional_PPC.docx
+++ b/01_Submissao_CEP_Palmilha_PPC/04_Termo_de_Anuencia_Institucional_PPC.docx
@@ -1,10 +1,10 @@
 
 <file path=word/document.xml><?xml version="1.0" encoding="utf-8"?>
-<w:document xmlns:wpc="http://schemas.microsoft.com/office/word/2010/wordprocessingCanvas" xmlns:mo="http://schemas.microsoft.com/office/mac/office/2008/main" xmlns:mc="http://schemas.openxmlformats.org/markup-compatibility/2006" xmlns:mv="urn:schemas-microsoft-com:mac:vml" xmlns:o="urn:schemas-microsoft-com:office:office" xmlns:r="http://schemas.openxmlformats.org/officeDocument/2006/relationships" xmlns:m="http://schemas.openxmlformats.org/officeDocument/2006/math" xmlns:v="urn:schemas-microsoft-com:vml" xmlns:wp14="http://schemas.microsoft.com/office/word/2010/wordprocessingDrawing" xmlns:wp="http://schemas.openxmlformats.org/drawingml/2006/wordprocessingDrawing" xmlns:w10="urn:schemas-microsoft-com:office:word" xmlns:w="http://schemas.openxmlformats.org/wordprocessingml/2006/main" xmlns:w14="http://schemas.microsoft.com/office/word/2010/wordml" xmlns:wpg="http://schemas.microsoft.com/office/word/2010/wordprocessingGroup" xmlns:wpi="http://schemas.microsoft.com/office/word/2010/wordprocessingInk" xmlns:wne="http://schemas.microsoft.com/office/word/2006/wordml" xmlns:wps="http://schemas.microsoft.com/office/word/2010/wordprocessingShape" mc:Ignorable="w14 wp14">
+<w:document xmlns:ve="http://schemas.openxmlformats.org/markup-compatibility/2006" xmlns:o="urn:schemas-microsoft-com:office:office" xmlns:r="http://schemas.openxmlformats.org/officeDocument/2006/relationships" xmlns:m="http://schemas.openxmlformats.org/officeDocument/2006/math" xmlns:v="urn:schemas-microsoft-com:vml" xmlns:wp="http://schemas.openxmlformats.org/drawingml/2006/wordprocessingDrawing" xmlns:w10="urn:schemas-microsoft-com:office:word" xmlns:w="http://schemas.openxmlformats.org/wordprocessingml/2006/main" xmlns:wne="http://schemas.microsoft.com/office/word/2006/wordml">
   <w:body>
     <w:p>
       <w:pPr>
-        <w:spacing w:before="0" w:after="80" w:line="240" w:lineRule="auto"/>
+        <w:spacing w:after="80" w:line="240" w:lineRule="auto"/>
         <w:jc w:val="center"/>
       </w:pPr>
       <w:r>
@@ -14,12 +14,40 @@
           <w:sz w:val="18"/>
         </w:rPr>
         <w:t>GOVERNO DO ESTADO DO RIO DE JANEIRO</w:t>
+      </w:r>
+      <w:r>
+        <w:rPr>
+          <w:rFonts w:ascii="Arial" w:hAnsi="Arial"/>
+          <w:b/>
+          <w:sz w:val="18"/>
+        </w:rPr>
         <w:br/>
         <w:t>SECRETARIA DE ESTADO DE CIÊNCIA, TECNOLOGIA E INOVAÇÃO</w:t>
+      </w:r>
+      <w:r>
+        <w:rPr>
+          <w:rFonts w:ascii="Arial" w:hAnsi="Arial"/>
+          <w:b/>
+          <w:sz w:val="18"/>
+        </w:rPr>
         <w:br/>
         <w:t>UNIVERSIDADE DO ESTADO DO RIO DE JANEIRO</w:t>
+      </w:r>
+      <w:r>
+        <w:rPr>
+          <w:rFonts w:ascii="Arial" w:hAnsi="Arial"/>
+          <w:b/>
+          <w:sz w:val="18"/>
+        </w:rPr>
         <w:br/>
         <w:t>HOSPITAL UNIVERSITÁRIO PEDRO ERNESTO / POLICLÍNICA PIQUET CARNEIRO</w:t>
+      </w:r>
+      <w:r>
+        <w:rPr>
+          <w:rFonts w:ascii="Arial" w:hAnsi="Arial"/>
+          <w:b/>
+          <w:sz w:val="18"/>
+        </w:rPr>
         <w:br/>
         <w:t>COMITÊ DE ÉTICA EM PESQUISA (CEP/HUPE)</w:t>
       </w:r>
@@ -35,12 +63,20 @@
           <w:b/>
           <w:sz w:val="24"/>
         </w:rPr>
-        <w:t>TERMO DE ANUÊNCIA / AUTORIZAÇÃO INSTITUCIONAL</w:t>
+        <w:t>TERMO DE ANUÊNCIA</w:t>
+      </w:r>
+      <w:r>
+        <w:rPr>
+          <w:rFonts w:ascii="Arial" w:hAnsi="Arial"/>
+          <w:b/>
+          <w:sz w:val="24"/>
+        </w:rPr>
+        <w:t xml:space="preserve"> / AUTORIZAÇÃO INSTITUCIONAL</w:t>
       </w:r>
     </w:p>
     <w:p>
       <w:pPr>
-        <w:spacing w:before="0" w:after="200" w:line="240" w:lineRule="auto"/>
+        <w:spacing w:line="240" w:lineRule="auto"/>
         <w:jc w:val="right"/>
       </w:pPr>
       <w:r>
@@ -58,7 +94,10 @@
         <w:jc w:val="both"/>
       </w:pPr>
       <w:r>
-        <w:t xml:space="preserve">Declaro para os devidos fins que o Serviço de Fisioterapia / Setor de Baropodometria da POLICLÍNICA PIQUET CARNEIRO (PPC) do COMPLEXO HUPE/UERJ, tem pleno conhecimento e manifesta total concordância com a condução e realização da Pesquisa intitulada: </w:t>
+        <w:t>Declaro para os devidos fins que o Serviço de Fisioterapia / Setor de Baropodometria da POLICLÍNICA PIQUET CARNEIRO (PPC) do COMPLEXO HUPE/UERJ, tem pleno conhecimento e manifesta total co</w:t>
+      </w:r>
+      <w:r>
+        <w:t xml:space="preserve">ncordância com a condução e realização da Pesquisa intitulada: </w:t>
       </w:r>
       <w:r>
         <w:rPr>
@@ -67,7 +106,13 @@
         <w:t xml:space="preserve">“Arquitetura de baixo custo para monitoramento preventivo do pé diabético: calibração com baropodômetro e prova de conceito na Policlínica Piquet Carneiro”, </w:t>
       </w:r>
       <w:r>
-        <w:t>sendo responsáveis o pesquisador discente Chrysthian Chrisley Tadeu Santos Silva (Mestrando) e a docente Prof.ª Dra. Rosa Maria Esteves Moreira da Costa (Orientadora/Pesquisadora Responsável), não havendo qualquer oposição à sua realização. Ratifico a ciência de que o projeto só poderá iniciar as etapas de coleta de dados com seres humanos após a expressa avaliação e aprovação consubstanciada do Comitê de Ética em Pesquisa do Hospital Universitário Pedro Ernesto da Universidade do Estado do Rio de Janeiro (CEP/HUPE/UERJ).</w:t>
+        <w:t>sendo responsáveis o pesquisador dis</w:t>
+      </w:r>
+      <w:r>
+        <w:t>cente Chrysthian Chrisley Tadeu Santos Silva (Mestrando) e a docente Prof.ª Dra. Rosa Maria Esteves Moreira da Costa (Orientadora/Pesquisadora Responsável), não havendo qualquer oposição à sua realização. Ratifico a ciência de que o projeto só poderá inici</w:t>
+      </w:r>
+      <w:r>
+        <w:t>ar as etapas de coleta de dados com seres humanos após a expressa avaliação e aprovação consubstanciada do Comitê de Ética em Pesquisa do Hospital Universitário Pedro Ernesto da Universidade do Estado do Rio de Janeiro (CEP/HUPE/UERJ).</w:t>
       </w:r>
     </w:p>
     <w:p>
@@ -78,10 +123,18 @@
         <w:rPr>
           <w:b/>
         </w:rPr>
-        <w:t xml:space="preserve">Período previsto para a coleta dos dados: </w:t>
+        <w:t>Período previsto par</w:t>
+      </w:r>
+      <w:r>
+        <w:rPr>
+          <w:b/>
+        </w:rPr>
+        <w:t xml:space="preserve">a a coleta dos dados: </w:t>
       </w:r>
       <w:r>
         <w:t>(01/11/2026 a 28/02/2027)</w:t>
+      </w:r>
+      <w:r>
         <w:br/>
       </w:r>
       <w:r>
@@ -89,39 +142,140 @@
           <w:b/>
         </w:rPr>
         <w:t>Os dados serão coletados através de:</w:t>
+      </w:r>
+      <w:r>
+        <w:rPr>
+          <w:b/>
+        </w:rPr>
         <w:br/>
       </w:r>
       <w:r>
         <w:t>(   ) ENTREVISTA       (   ) QUESTIONÁRIO       (   ) PRONTUÁRIO</w:t>
+      </w:r>
+      <w:r>
         <w:br/>
-        <w:t>( X ) OUTROS: Avaliação biomecânica comparativa através de plataforma de baropodometria e uso experimental temporário de palmilha inteligente instrumentada (microcontrolador Wemos Lolin D32, sensores FSR 402, sensor digital de alta precisão Sensirion SHT31-D e bateria LiPo 3.7V 600mAh) em 3 a 5 voluntários adultos com Diabetes Mellitus.</w:t>
+        <w:t>( X ) OUTROS: Avaliação biomecânica comparativa através de plataforma de baropodometria e uso experimental</w:t>
+      </w:r>
+      <w:r>
+        <w:t xml:space="preserve"> temporário de palmilha inteligente instrumentada (microcontrolador Wemos Lolin D32, sensores FSR 402, sensor digital de alta precisão Sensirion SHT31-D e bateria LiPo 3.7V 600mAh) em 3 a 5 voluntários </w:t>
+      </w:r>
+      <w:proofErr w:type="spellStart"/>
+      <w:r>
+        <w:t>adultos</w:t>
+      </w:r>
+      <w:proofErr w:type="spellEnd"/>
+      <w:r>
+        <w:t xml:space="preserve"> com Diabetes Mellitus.</w:t>
       </w:r>
     </w:p>
     <w:p>
       <w:pPr>
-        <w:spacing w:before="320" w:after="40" w:line="264" w:lineRule="auto"/>
+        <w:spacing w:before="120" w:after="80" w:line="288" w:lineRule="auto"/>
+      </w:pPr>
+    </w:p>
+    <w:p>
+      <w:pPr>
+        <w:spacing w:before="120" w:after="80" w:line="288" w:lineRule="auto"/>
+      </w:pPr>
+    </w:p>
+    <w:p>
+      <w:pPr>
+        <w:spacing w:after="40" w:line="264" w:lineRule="auto"/>
         <w:jc w:val="center"/>
+        <w:rPr>
+          <w:b/>
+          <w:bCs/>
+          <w:lang w:val="pt-BR"/>
+        </w:rPr>
       </w:pPr>
       <w:r>
         <w:rPr>
           <w:sz w:val="19"/>
         </w:rPr>
-        <w:t>____________________________________________________________</w:t>
+        <w:t>_______________________</w:t>
+      </w:r>
+      <w:r>
+        <w:rPr>
+          <w:sz w:val="19"/>
+        </w:rPr>
+        <w:t>_____________________________________</w:t>
+      </w:r>
+      <w:r>
+        <w:rPr>
+          <w:sz w:val="19"/>
+        </w:rPr>
         <w:br/>
       </w:r>
       <w:r>
         <w:rPr>
           <w:b/>
+          <w:bCs/>
+          <w:lang w:val="pt-BR"/>
         </w:rPr>
-        <w:t>[Nome do Responsável / Chefe do Serviço / Setor da PPC]</w:t>
+        <w:t xml:space="preserve">Eugenio </w:t>
+      </w:r>
+      <w:proofErr w:type="spellStart"/>
+      <w:r>
+        <w:rPr>
+          <w:b/>
+          <w:bCs/>
+          <w:lang w:val="pt-BR"/>
+        </w:rPr>
+        <w:t>Fuentes</w:t>
+      </w:r>
+      <w:proofErr w:type="spellEnd"/>
+      <w:r>
+        <w:rPr>
+          <w:b/>
+          <w:bCs/>
+          <w:lang w:val="pt-BR"/>
+        </w:rPr>
+        <w:t xml:space="preserve"> Pérez Júnior</w:t>
+      </w:r>
+    </w:p>
+    <w:p>
+      <w:pPr>
+        <w:spacing w:after="40" w:line="264" w:lineRule="auto"/>
+        <w:jc w:val="center"/>
+        <w:rPr>
+          <w:b/>
+          <w:bCs/>
+          <w:lang w:val="pt-BR"/>
+        </w:rPr>
+      </w:pPr>
+      <w:r>
+        <w:rPr>
+          <w:lang w:val="pt-BR"/>
+        </w:rPr>
+        <w:t xml:space="preserve">Laboratório de </w:t>
+      </w:r>
+      <w:proofErr w:type="spellStart"/>
+      <w:r>
+        <w:rPr>
+          <w:lang w:val="pt-BR"/>
+        </w:rPr>
+        <w:t>Podoposturologia</w:t>
+      </w:r>
+      <w:proofErr w:type="spellEnd"/>
+      <w:r>
+        <w:rPr>
+          <w:lang w:val="pt-BR"/>
+        </w:rPr>
+        <w:t xml:space="preserve"> e Confecção de Palmilhas </w:t>
+      </w:r>
+      <w:proofErr w:type="spellStart"/>
+      <w:r>
+        <w:t>da</w:t>
+      </w:r>
+      <w:proofErr w:type="spellEnd"/>
+      <w:r>
+        <w:t xml:space="preserve"> PPC/UERJ</w:t>
+      </w:r>
+      <w:r>
         <w:br/>
       </w:r>
       <w:r>
-        <w:t>Responsável pelo Setor de Baropodometria / Serviço de Fisioterapia da PPC/UERJ</w:t>
         <w:br/>
-        <w:t>Assinatura com Carimbo ou Certificação Digital GOV.BR</w:t>
-        <w:br/>
-        <w:t>Data: _____ / _____ / 2026</w:t>
       </w:r>
     </w:p>
     <w:p>
@@ -132,12 +286,18 @@
         <w:rPr>
           <w:color w:val="B4B4B4"/>
         </w:rPr>
-        <w:t>―――――――――――――――――――――――――――――――――――――――――――――――――――――――</w:t>
+        <w:t>――</w:t>
+      </w:r>
+      <w:r>
+        <w:rPr>
+          <w:color w:val="B4B4B4"/>
+        </w:rPr>
+        <w:t>―――――――――――――――――――――――――――――――――――――――――――――――――――――</w:t>
       </w:r>
     </w:p>
     <w:p>
       <w:pPr>
-        <w:spacing w:before="80" w:after="80" w:line="276" w:lineRule="auto"/>
+        <w:spacing w:before="80" w:after="80"/>
       </w:pPr>
       <w:r>
         <w:rPr>
@@ -150,19 +310,46 @@
     </w:p>
     <w:p>
       <w:pPr>
-        <w:spacing w:before="40" w:after="120" w:line="276" w:lineRule="auto"/>
+        <w:spacing w:before="40" w:after="120"/>
       </w:pPr>
       <w:r>
-        <w:t>Faculdade / Departamento / Programa: Faculdade de Ciências Médicas / Núcleo de Telessaúde e Saúde Digital (Programa de Pós-Graduação em Telessaúde e Saúde Digital (PPGTSD))</w:t>
+        <w:t>Faculdade / Departamento / Programa: Faculdade de Ciências Médicas / Núcleo de Telessaúde e Saúde Digital (Programa de Pós-Graduação em Telessaúde e Saú</w:t>
+      </w:r>
+      <w:r>
+        <w:t>de Digital (PPGTSD)</w:t>
+      </w:r>
+      <w:proofErr w:type="gramStart"/>
+      <w:r>
+        <w:t>)</w:t>
+      </w:r>
+      <w:proofErr w:type="gramEnd"/>
+      <w:r>
         <w:br/>
         <w:t>Nível: (   ) Graduação   (   ) Especialização   ( X ) Mestrado Profissional   (   ) Doutorado</w:t>
+      </w:r>
+      <w:r>
         <w:br/>
         <w:t>Condição: ( X ) Aluno Regular: Chrysthian Chrisley Tadeu Santos Silva    Matrícula: [Número de Matrícula]</w:t>
       </w:r>
     </w:p>
     <w:p>
       <w:pPr>
-        <w:spacing w:before="120" w:after="60" w:line="276" w:lineRule="auto"/>
+        <w:spacing w:before="40" w:after="120"/>
+      </w:pPr>
+    </w:p>
+    <w:p>
+      <w:pPr>
+        <w:spacing w:before="40" w:after="120"/>
+      </w:pPr>
+    </w:p>
+    <w:p>
+      <w:pPr>
+        <w:spacing w:before="40" w:after="120"/>
+      </w:pPr>
+    </w:p>
+    <w:p>
+      <w:pPr>
+        <w:spacing w:before="120" w:after="60"/>
       </w:pPr>
       <w:r>
         <w:rPr>
@@ -170,7 +357,16 @@
           <w:b/>
           <w:sz w:val="21"/>
         </w:rPr>
-        <w:t>TERMO DE RESPONSABILIDADE DO PESQUISADOR E ORIENTADOR</w:t>
+        <w:lastRenderedPageBreak/>
+        <w:t>TERMO DE RESPONSABILIDADE DO PESQUI</w:t>
+      </w:r>
+      <w:r>
+        <w:rPr>
+          <w:rFonts w:ascii="Arial" w:hAnsi="Arial"/>
+          <w:b/>
+          <w:sz w:val="21"/>
+        </w:rPr>
+        <w:t>SADOR E ORIENTADOR</w:t>
       </w:r>
     </w:p>
     <w:p>
@@ -179,23 +375,32 @@
         <w:jc w:val="both"/>
       </w:pPr>
       <w:r>
-        <w:t>Declaramos que nos responsabilizamos pelo andamento, realização e conclusão do projeto, comprometendo-nos a cumprir integralmente a Resolução CNS nº 466/2012, a Resolução CNS nº 510/2016 e as normas complementares, assegurando o resguardo da segurança, sigilo e bem-estar dos participantes da pesquisa. Comprometemo-nos a enviar relatórios parciais e final ao CEP/HUPE, a comunicar imediatamente qualquer interrupção ou evento adverso e a garantir que os dados obtidos serão empregados única e exclusivamente para a consecução dos objetivos científicos do presente projeto.</w:t>
+        <w:t>Declaramos que nos responsabilizamos pelo andamento, realização e conclusão do projeto, comprometendo-nos a cumprir integralmente a Resolução CNS nº 466/2012, a Resolução CNS nº 510/2016 e as normas complementares, assegurando o resguard</w:t>
+      </w:r>
+      <w:r>
+        <w:t>o da segurança, sigilo e bem-estar dos participantes da pesquisa. Comprometemo-nos a enviar relatórios parciais e final ao CEP/HUPE, a comunicar imediatamente qualquer interrupção ou evento adverso e a garantir que os dados obtidos serão empregados única e</w:t>
+      </w:r>
+      <w:r>
+        <w:t xml:space="preserve"> exclusivamente para a consecução dos objetivos científicos do presente projeto.</w:t>
       </w:r>
     </w:p>
     <w:tbl>
       <w:tblPr>
-        <w:tblW w:type="auto" w:w="0"/>
+        <w:tblW w:w="0" w:type="auto"/>
         <w:jc w:val="center"/>
-        <w:tblLook w:firstColumn="1" w:firstRow="1" w:lastColumn="0" w:lastRow="0" w:noHBand="0" w:noVBand="1" w:val="04A0"/>
+        <w:tblLook w:val="04A0"/>
       </w:tblPr>
       <w:tblGrid>
-        <w:gridCol w:w="4896"/>
-        <w:gridCol w:w="4896"/>
+        <w:gridCol w:w="4824"/>
+        <w:gridCol w:w="4824"/>
       </w:tblGrid>
       <w:tr>
+        <w:trPr>
+          <w:jc w:val="center"/>
+        </w:trPr>
         <w:tc>
           <w:tcPr>
-            <w:tcW w:type="dxa" w:w="4824"/>
+            <w:tcW w:w="4824" w:type="dxa"/>
           </w:tcPr>
           <w:p>
             <w:pPr>
@@ -206,10 +411,25 @@
                 <w:sz w:val="18"/>
               </w:rPr>
               <w:t>_____________________________________</w:t>
+            </w:r>
+            <w:r>
+              <w:rPr>
+                <w:sz w:val="18"/>
+              </w:rPr>
               <w:br/>
               <w:t>Chrysthian Chrisley Tadeu Santos Silva</w:t>
+            </w:r>
+            <w:r>
+              <w:rPr>
+                <w:sz w:val="18"/>
+              </w:rPr>
               <w:br/>
               <w:t>Pesquisador Discente (Mestrando)</w:t>
+            </w:r>
+            <w:r>
+              <w:rPr>
+                <w:sz w:val="18"/>
+              </w:rPr>
               <w:br/>
               <w:t>Data: ___/___/2026</w:t>
             </w:r>
@@ -217,7 +437,7 @@
         </w:tc>
         <w:tc>
           <w:tcPr>
-            <w:tcW w:type="dxa" w:w="4824"/>
+            <w:tcW w:w="4824" w:type="dxa"/>
           </w:tcPr>
           <w:p>
             <w:pPr>
@@ -228,10 +448,31 @@
                 <w:sz w:val="18"/>
               </w:rPr>
               <w:t>_____________________________________</w:t>
+            </w:r>
+            <w:r>
+              <w:rPr>
+                <w:sz w:val="18"/>
+              </w:rPr>
               <w:br/>
-              <w:t>Prof.ª Dra. Rosa Maria Esteves Moreira da Costa</w:t>
+              <w:t>Prof.ª D</w:t>
+            </w:r>
+            <w:r>
+              <w:rPr>
+                <w:sz w:val="18"/>
+              </w:rPr>
+              <w:t>ra. Rosa Maria Esteves Moreira da Costa</w:t>
+            </w:r>
+            <w:r>
+              <w:rPr>
+                <w:sz w:val="18"/>
+              </w:rPr>
               <w:br/>
               <w:t>Pesquisadora Responsável / Orientadora</w:t>
+            </w:r>
+            <w:r>
+              <w:rPr>
+                <w:sz w:val="18"/>
+              </w:rPr>
               <w:br/>
               <w:t>Data: ___/___/2026</w:t>
             </w:r>
@@ -239,6 +480,7 @@
         </w:tc>
       </w:tr>
     </w:tbl>
+    <w:p/>
     <w:sectPr>
       <w:pgSz w:w="12240" w:h="15840"/>
       <w:pgMar w:top="1152" w:right="1296" w:bottom="1152" w:left="1296" w:header="720" w:footer="720" w:gutter="0"/>
@@ -250,7 +492,7 @@
 </file>
 
 <file path=word/numbering.xml><?xml version="1.0" encoding="utf-8"?>
-<w:numbering xmlns:wpc="http://schemas.microsoft.com/office/word/2010/wordprocessingCanvas" xmlns:mo="http://schemas.microsoft.com/office/mac/office/2008/main" xmlns:mc="http://schemas.openxmlformats.org/markup-compatibility/2006" xmlns:mv="urn:schemas-microsoft-com:mac:vml" xmlns:o="urn:schemas-microsoft-com:office:office" xmlns:r="http://schemas.openxmlformats.org/officeDocument/2006/relationships" xmlns:m="http://schemas.openxmlformats.org/officeDocument/2006/math" xmlns:v="urn:schemas-microsoft-com:vml" xmlns:wp14="http://schemas.microsoft.com/office/word/2010/wordprocessingDrawing" xmlns:wp="http://schemas.openxmlformats.org/drawingml/2006/wordprocessingDrawing" xmlns:w10="urn:schemas-microsoft-com:office:word" xmlns:w="http://schemas.openxmlformats.org/wordprocessingml/2006/main" xmlns:w14="http://schemas.microsoft.com/office/word/2010/wordml" xmlns:wpg="http://schemas.microsoft.com/office/word/2010/wordprocessingGroup" xmlns:wpi="http://schemas.microsoft.com/office/word/2010/wordprocessingInk" xmlns:wne="http://schemas.microsoft.com/office/word/2006/wordml" xmlns:wps="http://schemas.microsoft.com/office/word/2010/wordprocessingShape" mc:Ignorable="w14 wp14">
+<w:numbering xmlns:ve="http://schemas.openxmlformats.org/markup-compatibility/2006" xmlns:o="urn:schemas-microsoft-com:office:office" xmlns:r="http://schemas.openxmlformats.org/officeDocument/2006/relationships" xmlns:m="http://schemas.openxmlformats.org/officeDocument/2006/math" xmlns:v="urn:schemas-microsoft-com:vml" xmlns:wp="http://schemas.openxmlformats.org/drawingml/2006/wordprocessingDrawing" xmlns:w10="urn:schemas-microsoft-com:office:word" xmlns:w="http://schemas.openxmlformats.org/wordprocessingml/2006/main" xmlns:wne="http://schemas.microsoft.com/office/word/2006/wordml">
   <w:abstractNum w:abstractNumId="0">
     <w:nsid w:val="FFFFFF7C"/>
     <w:multiLevelType w:val="singleLevel"/>
@@ -292,7 +534,7 @@
     <w:lvl w:ilvl="0">
       <w:start w:val="1"/>
       <w:numFmt w:val="decimal"/>
-      <w:pStyle w:val="ListNumber3"/>
+      <w:pStyle w:val="Numerada3"/>
       <w:lvlText w:val="%1."/>
       <w:lvlJc w:val="left"/>
       <w:pPr>
@@ -310,7 +552,7 @@
     <w:lvl w:ilvl="0">
       <w:start w:val="1"/>
       <w:numFmt w:val="decimal"/>
-      <w:pStyle w:val="ListNumber2"/>
+      <w:pStyle w:val="Numerada2"/>
       <w:lvlText w:val="%1."/>
       <w:lvlJc w:val="left"/>
       <w:pPr>
@@ -348,7 +590,7 @@
     <w:lvl w:ilvl="0">
       <w:start w:val="1"/>
       <w:numFmt w:val="bullet"/>
-      <w:pStyle w:val="ListBullet3"/>
+      <w:pStyle w:val="Commarcadores3"/>
       <w:lvlText w:val=""/>
       <w:lvlJc w:val="left"/>
       <w:pPr>
@@ -369,7 +611,7 @@
     <w:lvl w:ilvl="0">
       <w:start w:val="1"/>
       <w:numFmt w:val="bullet"/>
-      <w:pStyle w:val="ListBullet2"/>
+      <w:pStyle w:val="Commarcadores2"/>
       <w:lvlText w:val=""/>
       <w:lvlJc w:val="left"/>
       <w:pPr>
@@ -390,7 +632,7 @@
     <w:lvl w:ilvl="0">
       <w:start w:val="1"/>
       <w:numFmt w:val="decimal"/>
-      <w:pStyle w:val="ListNumber"/>
+      <w:pStyle w:val="Numerada"/>
       <w:lvlText w:val="%1."/>
       <w:lvlJc w:val="left"/>
       <w:pPr>
@@ -408,7 +650,7 @@
     <w:lvl w:ilvl="0">
       <w:start w:val="1"/>
       <w:numFmt w:val="bullet"/>
-      <w:pStyle w:val="ListBullet"/>
+      <w:pStyle w:val="Commarcadores"/>
       <w:lvlText w:val=""/>
       <w:lvlJc w:val="left"/>
       <w:pPr>
@@ -453,7 +695,7 @@
 </file>
 
 <file path=word/styles.xml><?xml version="1.0" encoding="utf-8"?>
-<w:styles xmlns:mc="http://schemas.openxmlformats.org/markup-compatibility/2006" xmlns:r="http://schemas.openxmlformats.org/officeDocument/2006/relationships" xmlns:w="http://schemas.openxmlformats.org/wordprocessingml/2006/main" xmlns:w14="http://schemas.microsoft.com/office/word/2010/wordml" mc:Ignorable="w14">
+<w:styles xmlns:r="http://schemas.openxmlformats.org/officeDocument/2006/relationships" xmlns:w="http://schemas.openxmlformats.org/wordprocessingml/2006/main">
   <w:docDefaults>
     <w:rPrDefault>
       <w:rPr>
@@ -469,7 +711,7 @@
       </w:pPr>
     </w:pPrDefault>
   </w:docDefaults>
-  <w:latentStyles w:defLockedState="0" w:defUIPriority="99" w:defSemiHidden="1" w:defUnhideWhenUsed="1" w:defQFormat="0" w:count="276">
+  <w:latentStyles w:defLockedState="0" w:defUIPriority="99" w:defSemiHidden="1" w:defUnhideWhenUsed="1" w:defQFormat="0" w:count="267">
     <w:lsdException w:name="Normal" w:semiHidden="0" w:uiPriority="0" w:unhideWhenUsed="0" w:qFormat="1"/>
     <w:lsdException w:name="heading 1" w:semiHidden="0" w:uiPriority="9" w:unhideWhenUsed="0" w:qFormat="1"/>
     <w:lsdException w:name="heading 2" w:uiPriority="9" w:qFormat="1"/>
@@ -613,55 +855,11 @@
     <w:qFormat/>
     <w:rsid w:val="00FC693F"/>
   </w:style>
-  <w:style w:type="paragraph" w:styleId="Header">
-    <w:name w:val="header"/>
-    <w:basedOn w:val="Normal"/>
-    <w:link w:val="HeaderChar"/>
-    <w:uiPriority w:val="99"/>
-    <w:unhideWhenUsed/>
-    <w:rsid w:val="00E618BF"/>
-    <w:pPr>
-      <w:tabs>
-        <w:tab w:val="center" w:pos="4680"/>
-        <w:tab w:val="right" w:pos="9360"/>
-      </w:tabs>
-      <w:spacing w:after="0" w:line="240" w:lineRule="auto"/>
-    </w:pPr>
-  </w:style>
-  <w:style w:type="character" w:customStyle="1" w:styleId="HeaderChar">
-    <w:name w:val="Header Char"/>
-    <w:basedOn w:val="DefaultParagraphFont"/>
-    <w:link w:val="Header"/>
-    <w:uiPriority w:val="99"/>
-    <w:rsid w:val="00E618BF"/>
-  </w:style>
-  <w:style w:type="paragraph" w:styleId="Footer">
-    <w:name w:val="footer"/>
-    <w:basedOn w:val="Normal"/>
-    <w:link w:val="FooterChar"/>
-    <w:uiPriority w:val="99"/>
-    <w:unhideWhenUsed/>
-    <w:rsid w:val="00E618BF"/>
-    <w:pPr>
-      <w:tabs>
-        <w:tab w:val="center" w:pos="4680"/>
-        <w:tab w:val="right" w:pos="9360"/>
-      </w:tabs>
-      <w:spacing w:after="0" w:line="240" w:lineRule="auto"/>
-    </w:pPr>
-  </w:style>
-  <w:style w:type="character" w:customStyle="1" w:styleId="FooterChar">
-    <w:name w:val="Footer Char"/>
-    <w:basedOn w:val="DefaultParagraphFont"/>
-    <w:link w:val="Footer"/>
-    <w:uiPriority w:val="99"/>
-    <w:rsid w:val="00E618BF"/>
-  </w:style>
-  <w:style w:type="paragraph" w:styleId="Heading1">
+  <w:style w:type="paragraph" w:styleId="Ttulo1">
     <w:name w:val="heading 1"/>
     <w:basedOn w:val="Normal"/>
     <w:next w:val="Normal"/>
-    <w:link w:val="Heading1Char"/>
+    <w:link w:val="Ttulo1Char"/>
     <w:uiPriority w:val="9"/>
     <w:qFormat/>
     <w:rsid w:val="00FC693F"/>
@@ -680,11 +878,11 @@
       <w:szCs w:val="28"/>
     </w:rPr>
   </w:style>
-  <w:style w:type="paragraph" w:styleId="Heading2">
+  <w:style w:type="paragraph" w:styleId="Ttulo2">
     <w:name w:val="heading 2"/>
     <w:basedOn w:val="Normal"/>
     <w:next w:val="Normal"/>
-    <w:link w:val="Heading2Char"/>
+    <w:link w:val="Ttulo2Char"/>
     <w:uiPriority w:val="9"/>
     <w:unhideWhenUsed/>
     <w:qFormat/>
@@ -704,11 +902,11 @@
       <w:szCs w:val="26"/>
     </w:rPr>
   </w:style>
-  <w:style w:type="paragraph" w:styleId="Heading3">
+  <w:style w:type="paragraph" w:styleId="Ttulo3">
     <w:name w:val="heading 3"/>
     <w:basedOn w:val="Normal"/>
     <w:next w:val="Normal"/>
-    <w:link w:val="Heading3Char"/>
+    <w:link w:val="Ttulo3Char"/>
     <w:uiPriority w:val="9"/>
     <w:unhideWhenUsed/>
     <w:qFormat/>
@@ -726,11 +924,11 @@
       <w:color w:val="4F81BD" w:themeColor="accent1"/>
     </w:rPr>
   </w:style>
-  <w:style w:type="paragraph" w:styleId="Heading4">
+  <w:style w:type="paragraph" w:styleId="Ttulo4">
     <w:name w:val="heading 4"/>
     <w:basedOn w:val="Normal"/>
     <w:next w:val="Normal"/>
-    <w:link w:val="Heading4Char"/>
+    <w:link w:val="Ttulo4Char"/>
     <w:uiPriority w:val="9"/>
     <w:semiHidden/>
     <w:unhideWhenUsed/>
@@ -751,11 +949,11 @@
       <w:color w:val="4F81BD" w:themeColor="accent1"/>
     </w:rPr>
   </w:style>
-  <w:style w:type="paragraph" w:styleId="Heading5">
+  <w:style w:type="paragraph" w:styleId="Ttulo5">
     <w:name w:val="heading 5"/>
     <w:basedOn w:val="Normal"/>
     <w:next w:val="Normal"/>
-    <w:link w:val="Heading5Char"/>
+    <w:link w:val="Ttulo5Char"/>
     <w:uiPriority w:val="9"/>
     <w:semiHidden/>
     <w:unhideWhenUsed/>
@@ -772,11 +970,11 @@
       <w:color w:val="243F60" w:themeColor="accent1" w:themeShade="7F"/>
     </w:rPr>
   </w:style>
-  <w:style w:type="paragraph" w:styleId="Heading6">
+  <w:style w:type="paragraph" w:styleId="Ttulo6">
     <w:name w:val="heading 6"/>
     <w:basedOn w:val="Normal"/>
     <w:next w:val="Normal"/>
-    <w:link w:val="Heading6Char"/>
+    <w:link w:val="Ttulo6Char"/>
     <w:uiPriority w:val="9"/>
     <w:semiHidden/>
     <w:unhideWhenUsed/>
@@ -795,11 +993,11 @@
       <w:color w:val="243F60" w:themeColor="accent1" w:themeShade="7F"/>
     </w:rPr>
   </w:style>
-  <w:style w:type="paragraph" w:styleId="Heading7">
+  <w:style w:type="paragraph" w:styleId="Ttulo7">
     <w:name w:val="heading 7"/>
     <w:basedOn w:val="Normal"/>
     <w:next w:val="Normal"/>
-    <w:link w:val="Heading7Char"/>
+    <w:link w:val="Ttulo7Char"/>
     <w:uiPriority w:val="9"/>
     <w:semiHidden/>
     <w:unhideWhenUsed/>
@@ -818,11 +1016,11 @@
       <w:color w:val="404040" w:themeColor="text1" w:themeTint="BF"/>
     </w:rPr>
   </w:style>
-  <w:style w:type="paragraph" w:styleId="Heading8">
+  <w:style w:type="paragraph" w:styleId="Ttulo8">
     <w:name w:val="heading 8"/>
     <w:basedOn w:val="Normal"/>
     <w:next w:val="Normal"/>
-    <w:link w:val="Heading8Char"/>
+    <w:link w:val="Ttulo8Char"/>
     <w:uiPriority w:val="9"/>
     <w:semiHidden/>
     <w:unhideWhenUsed/>
@@ -841,11 +1039,11 @@
       <w:szCs w:val="20"/>
     </w:rPr>
   </w:style>
-  <w:style w:type="paragraph" w:styleId="Heading9">
+  <w:style w:type="paragraph" w:styleId="Ttulo9">
     <w:name w:val="heading 9"/>
     <w:basedOn w:val="Normal"/>
     <w:next w:val="Normal"/>
-    <w:link w:val="Heading9Char"/>
+    <w:link w:val="Ttulo9Char"/>
     <w:uiPriority w:val="9"/>
     <w:semiHidden/>
     <w:unhideWhenUsed/>
@@ -866,17 +1064,17 @@
       <w:szCs w:val="20"/>
     </w:rPr>
   </w:style>
-  <w:style w:type="character" w:default="1" w:styleId="DefaultParagraphFont">
+  <w:style w:type="character" w:default="1" w:styleId="Fontepargpadro">
     <w:name w:val="Default Paragraph Font"/>
     <w:uiPriority w:val="1"/>
-    <w:semiHidden/>
     <w:unhideWhenUsed/>
   </w:style>
-  <w:style w:type="table" w:default="1" w:styleId="TableNormal">
+  <w:style w:type="table" w:default="1" w:styleId="Tabelanormal">
     <w:name w:val="Normal Table"/>
     <w:uiPriority w:val="99"/>
     <w:semiHidden/>
     <w:unhideWhenUsed/>
+    <w:qFormat/>
     <w:tblPr>
       <w:tblInd w:w="0" w:type="dxa"/>
       <w:tblCellMar>
@@ -887,13 +1085,57 @@
       </w:tblCellMar>
     </w:tblPr>
   </w:style>
-  <w:style w:type="numbering" w:default="1" w:styleId="NoList">
+  <w:style w:type="numbering" w:default="1" w:styleId="Semlista">
     <w:name w:val="No List"/>
     <w:uiPriority w:val="99"/>
     <w:semiHidden/>
     <w:unhideWhenUsed/>
   </w:style>
-  <w:style w:type="paragraph" w:styleId="NoSpacing">
+  <w:style w:type="paragraph" w:styleId="Cabealho">
+    <w:name w:val="header"/>
+    <w:basedOn w:val="Normal"/>
+    <w:link w:val="CabealhoChar"/>
+    <w:uiPriority w:val="99"/>
+    <w:unhideWhenUsed/>
+    <w:rsid w:val="00E618BF"/>
+    <w:pPr>
+      <w:tabs>
+        <w:tab w:val="center" w:pos="4680"/>
+        <w:tab w:val="right" w:pos="9360"/>
+      </w:tabs>
+      <w:spacing w:after="0" w:line="240" w:lineRule="auto"/>
+    </w:pPr>
+  </w:style>
+  <w:style w:type="character" w:customStyle="1" w:styleId="CabealhoChar">
+    <w:name w:val="Cabeçalho Char"/>
+    <w:basedOn w:val="Fontepargpadro"/>
+    <w:link w:val="Cabealho"/>
+    <w:uiPriority w:val="99"/>
+    <w:rsid w:val="00E618BF"/>
+  </w:style>
+  <w:style w:type="paragraph" w:styleId="Rodap">
+    <w:name w:val="footer"/>
+    <w:basedOn w:val="Normal"/>
+    <w:link w:val="RodapChar"/>
+    <w:uiPriority w:val="99"/>
+    <w:unhideWhenUsed/>
+    <w:rsid w:val="00E618BF"/>
+    <w:pPr>
+      <w:tabs>
+        <w:tab w:val="center" w:pos="4680"/>
+        <w:tab w:val="right" w:pos="9360"/>
+      </w:tabs>
+      <w:spacing w:after="0" w:line="240" w:lineRule="auto"/>
+    </w:pPr>
+  </w:style>
+  <w:style w:type="character" w:customStyle="1" w:styleId="RodapChar">
+    <w:name w:val="Rodapé Char"/>
+    <w:basedOn w:val="Fontepargpadro"/>
+    <w:link w:val="Rodap"/>
+    <w:uiPriority w:val="99"/>
+    <w:rsid w:val="00E618BF"/>
+  </w:style>
+  <w:style w:type="paragraph" w:styleId="SemEspaamento">
     <w:name w:val="No Spacing"/>
     <w:uiPriority w:val="1"/>
     <w:qFormat/>
@@ -902,10 +1144,10 @@
       <w:spacing w:after="0" w:line="240" w:lineRule="auto"/>
     </w:pPr>
   </w:style>
-  <w:style w:type="character" w:customStyle="1" w:styleId="Heading1Char">
-    <w:name w:val="Heading 1 Char"/>
-    <w:basedOn w:val="DefaultParagraphFont"/>
-    <w:link w:val="Heading1"/>
+  <w:style w:type="character" w:customStyle="1" w:styleId="Ttulo1Char">
+    <w:name w:val="Título 1 Char"/>
+    <w:basedOn w:val="Fontepargpadro"/>
+    <w:link w:val="Ttulo1"/>
     <w:uiPriority w:val="9"/>
     <w:rsid w:val="00FC693F"/>
     <w:rPr>
@@ -917,10 +1159,10 @@
       <w:szCs w:val="28"/>
     </w:rPr>
   </w:style>
-  <w:style w:type="character" w:customStyle="1" w:styleId="Heading2Char">
-    <w:name w:val="Heading 2 Char"/>
-    <w:basedOn w:val="DefaultParagraphFont"/>
-    <w:link w:val="Heading2"/>
+  <w:style w:type="character" w:customStyle="1" w:styleId="Ttulo2Char">
+    <w:name w:val="Título 2 Char"/>
+    <w:basedOn w:val="Fontepargpadro"/>
+    <w:link w:val="Ttulo2"/>
     <w:uiPriority w:val="9"/>
     <w:rsid w:val="00FC693F"/>
     <w:rPr>
@@ -932,10 +1174,10 @@
       <w:szCs w:val="26"/>
     </w:rPr>
   </w:style>
-  <w:style w:type="character" w:customStyle="1" w:styleId="Heading3Char">
-    <w:name w:val="Heading 3 Char"/>
-    <w:basedOn w:val="DefaultParagraphFont"/>
-    <w:link w:val="Heading3"/>
+  <w:style w:type="character" w:customStyle="1" w:styleId="Ttulo3Char">
+    <w:name w:val="Título 3 Char"/>
+    <w:basedOn w:val="Fontepargpadro"/>
+    <w:link w:val="Ttulo3"/>
     <w:uiPriority w:val="9"/>
     <w:rsid w:val="00FC693F"/>
     <w:rPr>
@@ -945,11 +1187,11 @@
       <w:color w:val="4F81BD" w:themeColor="accent1"/>
     </w:rPr>
   </w:style>
-  <w:style w:type="paragraph" w:styleId="Title">
+  <w:style w:type="paragraph" w:styleId="Ttulo">
     <w:name w:val="Title"/>
     <w:basedOn w:val="Normal"/>
     <w:next w:val="Normal"/>
-    <w:link w:val="TitleChar"/>
+    <w:link w:val="TtuloChar"/>
     <w:uiPriority w:val="10"/>
     <w:qFormat/>
     <w:rsid w:val="00FC693F"/>
@@ -969,10 +1211,10 @@
       <w:szCs w:val="52"/>
     </w:rPr>
   </w:style>
-  <w:style w:type="character" w:customStyle="1" w:styleId="TitleChar">
-    <w:name w:val="Title Char"/>
-    <w:basedOn w:val="DefaultParagraphFont"/>
-    <w:link w:val="Title"/>
+  <w:style w:type="character" w:customStyle="1" w:styleId="TtuloChar">
+    <w:name w:val="Título Char"/>
+    <w:basedOn w:val="Fontepargpadro"/>
+    <w:link w:val="Ttulo"/>
     <w:uiPriority w:val="10"/>
     <w:rsid w:val="00FC693F"/>
     <w:rPr>
@@ -984,11 +1226,11 @@
       <w:szCs w:val="52"/>
     </w:rPr>
   </w:style>
-  <w:style w:type="paragraph" w:styleId="Subtitle">
+  <w:style w:type="paragraph" w:styleId="Subttulo">
     <w:name w:val="Subtitle"/>
     <w:basedOn w:val="Normal"/>
     <w:next w:val="Normal"/>
-    <w:link w:val="SubtitleChar"/>
+    <w:link w:val="SubttuloChar"/>
     <w:uiPriority w:val="11"/>
     <w:qFormat/>
     <w:rsid w:val="00FC693F"/>
@@ -1007,10 +1249,10 @@
       <w:szCs w:val="24"/>
     </w:rPr>
   </w:style>
-  <w:style w:type="character" w:customStyle="1" w:styleId="SubtitleChar">
-    <w:name w:val="Subtitle Char"/>
-    <w:basedOn w:val="DefaultParagraphFont"/>
-    <w:link w:val="Subtitle"/>
+  <w:style w:type="character" w:customStyle="1" w:styleId="SubttuloChar">
+    <w:name w:val="Subtítulo Char"/>
+    <w:basedOn w:val="Fontepargpadro"/>
+    <w:link w:val="Subttulo"/>
     <w:uiPriority w:val="11"/>
     <w:rsid w:val="00FC693F"/>
     <w:rPr>
@@ -1023,7 +1265,7 @@
       <w:szCs w:val="24"/>
     </w:rPr>
   </w:style>
-  <w:style w:type="paragraph" w:styleId="ListParagraph">
+  <w:style w:type="paragraph" w:styleId="PargrafodaLista">
     <w:name w:val="List Paragraph"/>
     <w:basedOn w:val="Normal"/>
     <w:uiPriority w:val="34"/>
@@ -1034,10 +1276,10 @@
       <w:contextualSpacing/>
     </w:pPr>
   </w:style>
-  <w:style w:type="paragraph" w:styleId="BodyText">
+  <w:style w:type="paragraph" w:styleId="Corpodetexto">
     <w:name w:val="Body Text"/>
     <w:basedOn w:val="Normal"/>
-    <w:link w:val="BodyTextChar"/>
+    <w:link w:val="CorpodetextoChar"/>
     <w:uiPriority w:val="99"/>
     <w:unhideWhenUsed/>
     <w:rsid w:val="00AA1D8D"/>
@@ -1045,17 +1287,17 @@
       <w:spacing w:after="120"/>
     </w:pPr>
   </w:style>
-  <w:style w:type="character" w:customStyle="1" w:styleId="BodyTextChar">
-    <w:name w:val="Body Text Char"/>
-    <w:basedOn w:val="DefaultParagraphFont"/>
-    <w:link w:val="BodyText"/>
+  <w:style w:type="character" w:customStyle="1" w:styleId="CorpodetextoChar">
+    <w:name w:val="Corpo de texto Char"/>
+    <w:basedOn w:val="Fontepargpadro"/>
+    <w:link w:val="Corpodetexto"/>
     <w:uiPriority w:val="99"/>
     <w:rsid w:val="00AA1D8D"/>
   </w:style>
-  <w:style w:type="paragraph" w:styleId="BodyText2">
+  <w:style w:type="paragraph" w:styleId="Corpodetexto2">
     <w:name w:val="Body Text 2"/>
     <w:basedOn w:val="Normal"/>
-    <w:link w:val="BodyText2Char"/>
+    <w:link w:val="Corpodetexto2Char"/>
     <w:uiPriority w:val="99"/>
     <w:unhideWhenUsed/>
     <w:rsid w:val="00AA1D8D"/>
@@ -1063,17 +1305,17 @@
       <w:spacing w:after="120" w:line="480" w:lineRule="auto"/>
     </w:pPr>
   </w:style>
-  <w:style w:type="character" w:customStyle="1" w:styleId="BodyText2Char">
-    <w:name w:val="Body Text 2 Char"/>
-    <w:basedOn w:val="DefaultParagraphFont"/>
-    <w:link w:val="BodyText2"/>
+  <w:style w:type="character" w:customStyle="1" w:styleId="Corpodetexto2Char">
+    <w:name w:val="Corpo de texto 2 Char"/>
+    <w:basedOn w:val="Fontepargpadro"/>
+    <w:link w:val="Corpodetexto2"/>
     <w:uiPriority w:val="99"/>
     <w:rsid w:val="00AA1D8D"/>
   </w:style>
-  <w:style w:type="paragraph" w:styleId="BodyText3">
+  <w:style w:type="paragraph" w:styleId="Corpodetexto3">
     <w:name w:val="Body Text 3"/>
     <w:basedOn w:val="Normal"/>
-    <w:link w:val="BodyText3Char"/>
+    <w:link w:val="Corpodetexto3Char"/>
     <w:uiPriority w:val="99"/>
     <w:unhideWhenUsed/>
     <w:rsid w:val="00AA1D8D"/>
@@ -1085,10 +1327,10 @@
       <w:szCs w:val="16"/>
     </w:rPr>
   </w:style>
-  <w:style w:type="character" w:customStyle="1" w:styleId="BodyText3Char">
-    <w:name w:val="Body Text 3 Char"/>
-    <w:basedOn w:val="DefaultParagraphFont"/>
-    <w:link w:val="BodyText3"/>
+  <w:style w:type="character" w:customStyle="1" w:styleId="Corpodetexto3Char">
+    <w:name w:val="Corpo de texto 3 Char"/>
+    <w:basedOn w:val="Fontepargpadro"/>
+    <w:link w:val="Corpodetexto3"/>
     <w:uiPriority w:val="99"/>
     <w:rsid w:val="00AA1D8D"/>
     <w:rPr>
@@ -1096,7 +1338,7 @@
       <w:szCs w:val="16"/>
     </w:rPr>
   </w:style>
-  <w:style w:type="paragraph" w:styleId="List">
+  <w:style w:type="paragraph" w:styleId="Lista">
     <w:name w:val="List"/>
     <w:basedOn w:val="Normal"/>
     <w:uiPriority w:val="99"/>
@@ -1107,7 +1349,7 @@
       <w:contextualSpacing/>
     </w:pPr>
   </w:style>
-  <w:style w:type="paragraph" w:styleId="List2">
+  <w:style w:type="paragraph" w:styleId="Lista2">
     <w:name w:val="List 2"/>
     <w:basedOn w:val="Normal"/>
     <w:uiPriority w:val="99"/>
@@ -1118,7 +1360,7 @@
       <w:contextualSpacing/>
     </w:pPr>
   </w:style>
-  <w:style w:type="paragraph" w:styleId="List3">
+  <w:style w:type="paragraph" w:styleId="Lista3">
     <w:name w:val="List 3"/>
     <w:basedOn w:val="Normal"/>
     <w:uiPriority w:val="99"/>
@@ -1129,7 +1371,7 @@
       <w:contextualSpacing/>
     </w:pPr>
   </w:style>
-  <w:style w:type="paragraph" w:styleId="ListBullet">
+  <w:style w:type="paragraph" w:styleId="Commarcadores">
     <w:name w:val="List Bullet"/>
     <w:basedOn w:val="Normal"/>
     <w:uiPriority w:val="99"/>
@@ -1142,7 +1384,7 @@
       <w:contextualSpacing/>
     </w:pPr>
   </w:style>
-  <w:style w:type="paragraph" w:styleId="ListBullet2">
+  <w:style w:type="paragraph" w:styleId="Commarcadores2">
     <w:name w:val="List Bullet 2"/>
     <w:basedOn w:val="Normal"/>
     <w:uiPriority w:val="99"/>
@@ -1155,7 +1397,7 @@
       <w:contextualSpacing/>
     </w:pPr>
   </w:style>
-  <w:style w:type="paragraph" w:styleId="ListBullet3">
+  <w:style w:type="paragraph" w:styleId="Commarcadores3">
     <w:name w:val="List Bullet 3"/>
     <w:basedOn w:val="Normal"/>
     <w:uiPriority w:val="99"/>
@@ -1168,7 +1410,7 @@
       <w:contextualSpacing/>
     </w:pPr>
   </w:style>
-  <w:style w:type="paragraph" w:styleId="ListNumber">
+  <w:style w:type="paragraph" w:styleId="Numerada">
     <w:name w:val="List Number"/>
     <w:basedOn w:val="Normal"/>
     <w:uiPriority w:val="99"/>
@@ -1181,7 +1423,7 @@
       <w:contextualSpacing/>
     </w:pPr>
   </w:style>
-  <w:style w:type="paragraph" w:styleId="ListNumber2">
+  <w:style w:type="paragraph" w:styleId="Numerada2">
     <w:name w:val="List Number 2"/>
     <w:basedOn w:val="Normal"/>
     <w:uiPriority w:val="99"/>
@@ -1194,7 +1436,7 @@
       <w:contextualSpacing/>
     </w:pPr>
   </w:style>
-  <w:style w:type="paragraph" w:styleId="ListNumber3">
+  <w:style w:type="paragraph" w:styleId="Numerada3">
     <w:name w:val="List Number 3"/>
     <w:basedOn w:val="Normal"/>
     <w:uiPriority w:val="99"/>
@@ -1207,7 +1449,7 @@
       <w:contextualSpacing/>
     </w:pPr>
   </w:style>
-  <w:style w:type="paragraph" w:styleId="ListContinue">
+  <w:style w:type="paragraph" w:styleId="Listadecontinuao">
     <w:name w:val="List Continue"/>
     <w:basedOn w:val="Normal"/>
     <w:uiPriority w:val="99"/>
@@ -1219,7 +1461,7 @@
       <w:contextualSpacing/>
     </w:pPr>
   </w:style>
-  <w:style w:type="paragraph" w:styleId="ListContinue2">
+  <w:style w:type="paragraph" w:styleId="Listadecontinuao2">
     <w:name w:val="List Continue 2"/>
     <w:basedOn w:val="Normal"/>
     <w:uiPriority w:val="99"/>
@@ -1231,7 +1473,7 @@
       <w:contextualSpacing/>
     </w:pPr>
   </w:style>
-  <w:style w:type="paragraph" w:styleId="ListContinue3">
+  <w:style w:type="paragraph" w:styleId="Listadecontinuao3">
     <w:name w:val="List Continue 3"/>
     <w:basedOn w:val="Normal"/>
     <w:uiPriority w:val="99"/>
@@ -1243,9 +1485,9 @@
       <w:contextualSpacing/>
     </w:pPr>
   </w:style>
-  <w:style w:type="paragraph" w:styleId="MacroText">
+  <w:style w:type="paragraph" w:styleId="Textodemacro">
     <w:name w:val="macro"/>
-    <w:link w:val="MacroTextChar"/>
+    <w:link w:val="TextodemacroChar"/>
     <w:uiPriority w:val="99"/>
     <w:unhideWhenUsed/>
     <w:rsid w:val="0029639D"/>
@@ -1266,10 +1508,10 @@
       <w:szCs w:val="20"/>
     </w:rPr>
   </w:style>
-  <w:style w:type="character" w:customStyle="1" w:styleId="MacroTextChar">
-    <w:name w:val="Macro Text Char"/>
-    <w:basedOn w:val="DefaultParagraphFont"/>
-    <w:link w:val="MacroText"/>
+  <w:style w:type="character" w:customStyle="1" w:styleId="TextodemacroChar">
+    <w:name w:val="Texto de macro Char"/>
+    <w:basedOn w:val="Fontepargpadro"/>
+    <w:link w:val="Textodemacro"/>
     <w:uiPriority w:val="99"/>
     <w:rsid w:val="0029639D"/>
     <w:rPr>
@@ -1278,11 +1520,11 @@
       <w:szCs w:val="20"/>
     </w:rPr>
   </w:style>
-  <w:style w:type="paragraph" w:styleId="Quote">
+  <w:style w:type="paragraph" w:styleId="Citao">
     <w:name w:val="Quote"/>
     <w:basedOn w:val="Normal"/>
     <w:next w:val="Normal"/>
-    <w:link w:val="QuoteChar"/>
+    <w:link w:val="CitaoChar"/>
     <w:uiPriority w:val="29"/>
     <w:qFormat/>
     <w:rsid w:val="00FC693F"/>
@@ -1292,10 +1534,10 @@
       <w:color w:val="000000" w:themeColor="text1"/>
     </w:rPr>
   </w:style>
-  <w:style w:type="character" w:customStyle="1" w:styleId="QuoteChar">
-    <w:name w:val="Quote Char"/>
-    <w:basedOn w:val="DefaultParagraphFont"/>
-    <w:link w:val="Quote"/>
+  <w:style w:type="character" w:customStyle="1" w:styleId="CitaoChar">
+    <w:name w:val="Citação Char"/>
+    <w:basedOn w:val="Fontepargpadro"/>
+    <w:link w:val="Citao"/>
     <w:uiPriority w:val="29"/>
     <w:rsid w:val="00FC693F"/>
     <w:rPr>
@@ -1304,10 +1546,10 @@
       <w:color w:val="000000" w:themeColor="text1"/>
     </w:rPr>
   </w:style>
-  <w:style w:type="character" w:customStyle="1" w:styleId="Heading4Char">
-    <w:name w:val="Heading 4 Char"/>
-    <w:basedOn w:val="DefaultParagraphFont"/>
-    <w:link w:val="Heading4"/>
+  <w:style w:type="character" w:customStyle="1" w:styleId="Ttulo4Char">
+    <w:name w:val="Título 4 Char"/>
+    <w:basedOn w:val="Fontepargpadro"/>
+    <w:link w:val="Ttulo4"/>
     <w:uiPriority w:val="9"/>
     <w:semiHidden/>
     <w:rsid w:val="00FC693F"/>
@@ -1320,10 +1562,10 @@
       <w:color w:val="4F81BD" w:themeColor="accent1"/>
     </w:rPr>
   </w:style>
-  <w:style w:type="character" w:customStyle="1" w:styleId="Heading5Char">
-    <w:name w:val="Heading 5 Char"/>
-    <w:basedOn w:val="DefaultParagraphFont"/>
-    <w:link w:val="Heading5"/>
+  <w:style w:type="character" w:customStyle="1" w:styleId="Ttulo5Char">
+    <w:name w:val="Título 5 Char"/>
+    <w:basedOn w:val="Fontepargpadro"/>
+    <w:link w:val="Ttulo5"/>
     <w:uiPriority w:val="9"/>
     <w:semiHidden/>
     <w:rsid w:val="00FC693F"/>
@@ -1332,10 +1574,10 @@
       <w:color w:val="243F60" w:themeColor="accent1" w:themeShade="7F"/>
     </w:rPr>
   </w:style>
-  <w:style w:type="character" w:customStyle="1" w:styleId="Heading6Char">
-    <w:name w:val="Heading 6 Char"/>
-    <w:basedOn w:val="DefaultParagraphFont"/>
-    <w:link w:val="Heading6"/>
+  <w:style w:type="character" w:customStyle="1" w:styleId="Ttulo6Char">
+    <w:name w:val="Título 6 Char"/>
+    <w:basedOn w:val="Fontepargpadro"/>
+    <w:link w:val="Ttulo6"/>
     <w:uiPriority w:val="9"/>
     <w:semiHidden/>
     <w:rsid w:val="00FC693F"/>
@@ -1346,10 +1588,10 @@
       <w:color w:val="243F60" w:themeColor="accent1" w:themeShade="7F"/>
     </w:rPr>
   </w:style>
-  <w:style w:type="character" w:customStyle="1" w:styleId="Heading7Char">
-    <w:name w:val="Heading 7 Char"/>
-    <w:basedOn w:val="DefaultParagraphFont"/>
-    <w:link w:val="Heading7"/>
+  <w:style w:type="character" w:customStyle="1" w:styleId="Ttulo7Char">
+    <w:name w:val="Título 7 Char"/>
+    <w:basedOn w:val="Fontepargpadro"/>
+    <w:link w:val="Ttulo7"/>
     <w:uiPriority w:val="9"/>
     <w:semiHidden/>
     <w:rsid w:val="00FC693F"/>
@@ -1360,10 +1602,10 @@
       <w:color w:val="404040" w:themeColor="text1" w:themeTint="BF"/>
     </w:rPr>
   </w:style>
-  <w:style w:type="character" w:customStyle="1" w:styleId="Heading8Char">
-    <w:name w:val="Heading 8 Char"/>
-    <w:basedOn w:val="DefaultParagraphFont"/>
-    <w:link w:val="Heading8"/>
+  <w:style w:type="character" w:customStyle="1" w:styleId="Ttulo8Char">
+    <w:name w:val="Título 8 Char"/>
+    <w:basedOn w:val="Fontepargpadro"/>
+    <w:link w:val="Ttulo8"/>
     <w:uiPriority w:val="9"/>
     <w:semiHidden/>
     <w:rsid w:val="00FC693F"/>
@@ -1374,10 +1616,10 @@
       <w:szCs w:val="20"/>
     </w:rPr>
   </w:style>
-  <w:style w:type="character" w:customStyle="1" w:styleId="Heading9Char">
-    <w:name w:val="Heading 9 Char"/>
-    <w:basedOn w:val="DefaultParagraphFont"/>
-    <w:link w:val="Heading9"/>
+  <w:style w:type="character" w:customStyle="1" w:styleId="Ttulo9Char">
+    <w:name w:val="Título 9 Char"/>
+    <w:basedOn w:val="Fontepargpadro"/>
+    <w:link w:val="Ttulo9"/>
     <w:uiPriority w:val="9"/>
     <w:semiHidden/>
     <w:rsid w:val="00FC693F"/>
@@ -1390,7 +1632,7 @@
       <w:szCs w:val="20"/>
     </w:rPr>
   </w:style>
-  <w:style w:type="paragraph" w:styleId="Caption">
+  <w:style w:type="paragraph" w:styleId="Legenda">
     <w:name w:val="caption"/>
     <w:basedOn w:val="Normal"/>
     <w:next w:val="Normal"/>
@@ -1410,9 +1652,9 @@
       <w:szCs w:val="18"/>
     </w:rPr>
   </w:style>
-  <w:style w:type="character" w:styleId="Strong">
+  <w:style w:type="character" w:styleId="Forte">
     <w:name w:val="Strong"/>
-    <w:basedOn w:val="DefaultParagraphFont"/>
+    <w:basedOn w:val="Fontepargpadro"/>
     <w:uiPriority w:val="22"/>
     <w:qFormat/>
     <w:rsid w:val="00FC693F"/>
@@ -1421,9 +1663,9 @@
       <w:bCs/>
     </w:rPr>
   </w:style>
-  <w:style w:type="character" w:styleId="Emphasis">
+  <w:style w:type="character" w:styleId="nfase">
     <w:name w:val="Emphasis"/>
-    <w:basedOn w:val="DefaultParagraphFont"/>
+    <w:basedOn w:val="Fontepargpadro"/>
     <w:uiPriority w:val="20"/>
     <w:qFormat/>
     <w:rsid w:val="00FC693F"/>
@@ -1432,11 +1674,11 @@
       <w:iCs/>
     </w:rPr>
   </w:style>
-  <w:style w:type="paragraph" w:styleId="IntenseQuote">
+  <w:style w:type="paragraph" w:styleId="CitaoIntensa">
     <w:name w:val="Intense Quote"/>
     <w:basedOn w:val="Normal"/>
     <w:next w:val="Normal"/>
-    <w:link w:val="IntenseQuoteChar"/>
+    <w:link w:val="CitaoIntensaChar"/>
     <w:uiPriority w:val="30"/>
     <w:qFormat/>
     <w:rsid w:val="00FC693F"/>
@@ -1455,10 +1697,10 @@
       <w:color w:val="4F81BD" w:themeColor="accent1"/>
     </w:rPr>
   </w:style>
-  <w:style w:type="character" w:customStyle="1" w:styleId="IntenseQuoteChar">
-    <w:name w:val="Intense Quote Char"/>
-    <w:basedOn w:val="DefaultParagraphFont"/>
-    <w:link w:val="IntenseQuote"/>
+  <w:style w:type="character" w:customStyle="1" w:styleId="CitaoIntensaChar">
+    <w:name w:val="Citação Intensa Char"/>
+    <w:basedOn w:val="Fontepargpadro"/>
+    <w:link w:val="CitaoIntensa"/>
     <w:uiPriority w:val="30"/>
     <w:rsid w:val="00FC693F"/>
     <w:rPr>
@@ -1469,9 +1711,9 @@
       <w:color w:val="4F81BD" w:themeColor="accent1"/>
     </w:rPr>
   </w:style>
-  <w:style w:type="character" w:styleId="SubtleEmphasis">
+  <w:style w:type="character" w:styleId="nfaseSutil">
     <w:name w:val="Subtle Emphasis"/>
-    <w:basedOn w:val="DefaultParagraphFont"/>
+    <w:basedOn w:val="Fontepargpadro"/>
     <w:uiPriority w:val="19"/>
     <w:qFormat/>
     <w:rsid w:val="00FC693F"/>
@@ -1481,9 +1723,9 @@
       <w:color w:val="808080" w:themeColor="text1" w:themeTint="7F"/>
     </w:rPr>
   </w:style>
-  <w:style w:type="character" w:styleId="IntenseEmphasis">
+  <w:style w:type="character" w:styleId="nfaseIntensa">
     <w:name w:val="Intense Emphasis"/>
-    <w:basedOn w:val="DefaultParagraphFont"/>
+    <w:basedOn w:val="Fontepargpadro"/>
     <w:uiPriority w:val="21"/>
     <w:qFormat/>
     <w:rsid w:val="00FC693F"/>
@@ -1495,9 +1737,9 @@
       <w:color w:val="4F81BD" w:themeColor="accent1"/>
     </w:rPr>
   </w:style>
-  <w:style w:type="character" w:styleId="SubtleReference">
+  <w:style w:type="character" w:styleId="RefernciaSutil">
     <w:name w:val="Subtle Reference"/>
-    <w:basedOn w:val="DefaultParagraphFont"/>
+    <w:basedOn w:val="Fontepargpadro"/>
     <w:uiPriority w:val="31"/>
     <w:qFormat/>
     <w:rsid w:val="00FC693F"/>
@@ -1507,9 +1749,9 @@
       <w:u w:val="single"/>
     </w:rPr>
   </w:style>
-  <w:style w:type="character" w:styleId="IntenseReference">
+  <w:style w:type="character" w:styleId="RefernciaIntensa">
     <w:name w:val="Intense Reference"/>
-    <w:basedOn w:val="DefaultParagraphFont"/>
+    <w:basedOn w:val="Fontepargpadro"/>
     <w:uiPriority w:val="32"/>
     <w:qFormat/>
     <w:rsid w:val="00FC693F"/>
@@ -1522,9 +1764,9 @@
       <w:u w:val="single"/>
     </w:rPr>
   </w:style>
-  <w:style w:type="character" w:styleId="BookTitle">
+  <w:style w:type="character" w:styleId="TtulodoLivro">
     <w:name w:val="Book Title"/>
-    <w:basedOn w:val="DefaultParagraphFont"/>
+    <w:basedOn w:val="Fontepargpadro"/>
     <w:uiPriority w:val="33"/>
     <w:qFormat/>
     <w:rsid w:val="00FC693F"/>
@@ -1535,9 +1777,9 @@
       <w:spacing w:val="5"/>
     </w:rPr>
   </w:style>
-  <w:style w:type="paragraph" w:styleId="TOCHeading">
+  <w:style w:type="paragraph" w:styleId="CabealhodoSumrio">
     <w:name w:val="TOC Heading"/>
-    <w:basedOn w:val="Heading1"/>
+    <w:basedOn w:val="Ttulo1"/>
     <w:next w:val="Normal"/>
     <w:uiPriority w:val="39"/>
     <w:semiHidden/>
@@ -1548,9 +1790,9 @@
       <w:outlineLvl w:val="9"/>
     </w:pPr>
   </w:style>
-  <w:style w:type="table" w:styleId="TableGrid">
+  <w:style w:type="table" w:styleId="Tabelacomgrade">
     <w:name w:val="Table Grid"/>
-    <w:basedOn w:val="TableNormal"/>
+    <w:basedOn w:val="Tabelanormal"/>
     <w:uiPriority w:val="59"/>
     <w:rsid w:val="00FC693F"/>
     <w:pPr>
@@ -1574,9 +1816,9 @@
       </w:tblCellMar>
     </w:tblPr>
   </w:style>
-  <w:style w:type="table" w:styleId="LightShading">
+  <w:style w:type="table" w:customStyle="1" w:styleId="SombreamentoClaro">
     <w:name w:val="Light Shading"/>
-    <w:basedOn w:val="TableNormal"/>
+    <w:basedOn w:val="Tabelanormal"/>
     <w:uiPriority w:val="60"/>
     <w:rsid w:val="00FC693F"/>
     <w:pPr>
@@ -1677,9 +1919,9 @@
       </w:tcPr>
     </w:tblStylePr>
   </w:style>
-  <w:style w:type="table" w:styleId="LightShading-Accent1">
+  <w:style w:type="table" w:customStyle="1" w:styleId="SombreamentoClaro-nfase1">
     <w:name w:val="Light Shading Accent 1"/>
-    <w:basedOn w:val="TableNormal"/>
+    <w:basedOn w:val="Tabelanormal"/>
     <w:uiPriority w:val="60"/>
     <w:rsid w:val="00FC693F"/>
     <w:pPr>
@@ -1780,9 +2022,9 @@
       </w:tcPr>
     </w:tblStylePr>
   </w:style>
-  <w:style w:type="table" w:styleId="LightShading-Accent2">
+  <w:style w:type="table" w:styleId="SombreamentoClaro-nfase2">
     <w:name w:val="Light Shading Accent 2"/>
-    <w:basedOn w:val="TableNormal"/>
+    <w:basedOn w:val="Tabelanormal"/>
     <w:uiPriority w:val="60"/>
     <w:rsid w:val="00FC693F"/>
     <w:pPr>
@@ -1883,9 +2125,9 @@
       </w:tcPr>
     </w:tblStylePr>
   </w:style>
-  <w:style w:type="table" w:styleId="LightShading-Accent3">
+  <w:style w:type="table" w:styleId="SombreamentoClaro-nfase3">
     <w:name w:val="Light Shading Accent 3"/>
-    <w:basedOn w:val="TableNormal"/>
+    <w:basedOn w:val="Tabelanormal"/>
     <w:uiPriority w:val="60"/>
     <w:rsid w:val="00FC693F"/>
     <w:pPr>
@@ -1986,9 +2228,9 @@
       </w:tcPr>
     </w:tblStylePr>
   </w:style>
-  <w:style w:type="table" w:styleId="LightShading-Accent4">
+  <w:style w:type="table" w:styleId="SombreamentoClaro-nfase4">
     <w:name w:val="Light Shading Accent 4"/>
-    <w:basedOn w:val="TableNormal"/>
+    <w:basedOn w:val="Tabelanormal"/>
     <w:uiPriority w:val="60"/>
     <w:rsid w:val="00FC693F"/>
     <w:pPr>
@@ -2089,9 +2331,9 @@
       </w:tcPr>
     </w:tblStylePr>
   </w:style>
-  <w:style w:type="table" w:styleId="LightShading-Accent5">
+  <w:style w:type="table" w:styleId="SombreamentoClaro-nfase5">
     <w:name w:val="Light Shading Accent 5"/>
-    <w:basedOn w:val="TableNormal"/>
+    <w:basedOn w:val="Tabelanormal"/>
     <w:uiPriority w:val="60"/>
     <w:rsid w:val="00FC693F"/>
     <w:pPr>
@@ -2192,9 +2434,9 @@
       </w:tcPr>
     </w:tblStylePr>
   </w:style>
-  <w:style w:type="table" w:styleId="LightShading-Accent6">
+  <w:style w:type="table" w:styleId="SombreamentoClaro-nfase6">
     <w:name w:val="Light Shading Accent 6"/>
-    <w:basedOn w:val="TableNormal"/>
+    <w:basedOn w:val="Tabelanormal"/>
     <w:uiPriority w:val="60"/>
     <w:rsid w:val="00FC693F"/>
     <w:pPr>
@@ -2295,9 +2537,9 @@
       </w:tcPr>
     </w:tblStylePr>
   </w:style>
-  <w:style w:type="table" w:styleId="LightList">
+  <w:style w:type="table" w:customStyle="1" w:styleId="ListaClara">
     <w:name w:val="Light List"/>
-    <w:basedOn w:val="TableNormal"/>
+    <w:basedOn w:val="Tabelanormal"/>
     <w:uiPriority w:val="61"/>
     <w:rsid w:val="00FC693F"/>
     <w:pPr>
@@ -2387,9 +2629,9 @@
       </w:tcPr>
     </w:tblStylePr>
   </w:style>
-  <w:style w:type="table" w:styleId="LightList-Accent1">
+  <w:style w:type="table" w:customStyle="1" w:styleId="ListaClara-nfase1">
     <w:name w:val="Light List Accent 1"/>
-    <w:basedOn w:val="TableNormal"/>
+    <w:basedOn w:val="Tabelanormal"/>
     <w:uiPriority w:val="61"/>
     <w:rsid w:val="00FC693F"/>
     <w:pPr>
@@ -2479,9 +2721,9 @@
       </w:tcPr>
     </w:tblStylePr>
   </w:style>
-  <w:style w:type="table" w:styleId="LightList-Accent2">
+  <w:style w:type="table" w:styleId="ListaClara-nfase2">
     <w:name w:val="Light List Accent 2"/>
-    <w:basedOn w:val="TableNormal"/>
+    <w:basedOn w:val="Tabelanormal"/>
     <w:uiPriority w:val="61"/>
     <w:rsid w:val="00CB0664"/>
     <w:pPr>
@@ -2571,9 +2813,9 @@
       </w:tcPr>
     </w:tblStylePr>
   </w:style>
-  <w:style w:type="table" w:styleId="LightList-Accent3">
+  <w:style w:type="table" w:styleId="ListaClara-nfase3">
     <w:name w:val="Light List Accent 3"/>
-    <w:basedOn w:val="TableNormal"/>
+    <w:basedOn w:val="Tabelanormal"/>
     <w:uiPriority w:val="61"/>
     <w:rsid w:val="00CB0664"/>
     <w:pPr>
@@ -2663,9 +2905,9 @@
       </w:tcPr>
     </w:tblStylePr>
   </w:style>
-  <w:style w:type="table" w:styleId="LightList-Accent4">
+  <w:style w:type="table" w:styleId="ListaClara-nfase4">
     <w:name w:val="Light List Accent 4"/>
-    <w:basedOn w:val="TableNormal"/>
+    <w:basedOn w:val="Tabelanormal"/>
     <w:uiPriority w:val="61"/>
     <w:rsid w:val="00CB0664"/>
     <w:pPr>
@@ -2755,9 +2997,9 @@
       </w:tcPr>
     </w:tblStylePr>
   </w:style>
-  <w:style w:type="table" w:styleId="LightList-Accent5">
+  <w:style w:type="table" w:styleId="ListaClara-nfase5">
     <w:name w:val="Light List Accent 5"/>
-    <w:basedOn w:val="TableNormal"/>
+    <w:basedOn w:val="Tabelanormal"/>
     <w:uiPriority w:val="61"/>
     <w:rsid w:val="00CB0664"/>
     <w:pPr>
@@ -2847,9 +3089,9 @@
       </w:tcPr>
     </w:tblStylePr>
   </w:style>
-  <w:style w:type="table" w:styleId="LightList-Accent6">
+  <w:style w:type="table" w:styleId="ListaClara-nfase6">
     <w:name w:val="Light List Accent 6"/>
-    <w:basedOn w:val="TableNormal"/>
+    <w:basedOn w:val="Tabelanormal"/>
     <w:uiPriority w:val="61"/>
     <w:rsid w:val="00CB0664"/>
     <w:pPr>
@@ -2939,9 +3181,9 @@
       </w:tcPr>
     </w:tblStylePr>
   </w:style>
-  <w:style w:type="table" w:styleId="LightGrid">
+  <w:style w:type="table" w:customStyle="1" w:styleId="GradeClara">
     <w:name w:val="Light Grid"/>
-    <w:basedOn w:val="TableNormal"/>
+    <w:basedOn w:val="Tabelanormal"/>
     <w:uiPriority w:val="62"/>
     <w:rsid w:val="00CB0664"/>
     <w:pPr>
@@ -3069,9 +3311,9 @@
       </w:tcPr>
     </w:tblStylePr>
   </w:style>
-  <w:style w:type="table" w:styleId="LightGrid-Accent1">
+  <w:style w:type="table" w:customStyle="1" w:styleId="GradeClara-nfase1">
     <w:name w:val="Light Grid Accent 1"/>
-    <w:basedOn w:val="TableNormal"/>
+    <w:basedOn w:val="Tabelanormal"/>
     <w:uiPriority w:val="62"/>
     <w:rsid w:val="00CB0664"/>
     <w:pPr>
@@ -3199,9 +3441,9 @@
       </w:tcPr>
     </w:tblStylePr>
   </w:style>
-  <w:style w:type="table" w:styleId="LightGrid-Accent2">
+  <w:style w:type="table" w:styleId="GradeClara-nfase2">
     <w:name w:val="Light Grid Accent 2"/>
-    <w:basedOn w:val="TableNormal"/>
+    <w:basedOn w:val="Tabelanormal"/>
     <w:uiPriority w:val="62"/>
     <w:rsid w:val="00CB0664"/>
     <w:pPr>
@@ -3329,9 +3571,9 @@
       </w:tcPr>
     </w:tblStylePr>
   </w:style>
-  <w:style w:type="table" w:styleId="LightGrid-Accent3">
+  <w:style w:type="table" w:styleId="GradeClara-nfase3">
     <w:name w:val="Light Grid Accent 3"/>
-    <w:basedOn w:val="TableNormal"/>
+    <w:basedOn w:val="Tabelanormal"/>
     <w:uiPriority w:val="62"/>
     <w:rsid w:val="00CB0664"/>
     <w:pPr>
@@ -3459,9 +3701,9 @@
       </w:tcPr>
     </w:tblStylePr>
   </w:style>
-  <w:style w:type="table" w:styleId="LightGrid-Accent4">
+  <w:style w:type="table" w:styleId="GradeClara-nfase4">
     <w:name w:val="Light Grid Accent 4"/>
-    <w:basedOn w:val="TableNormal"/>
+    <w:basedOn w:val="Tabelanormal"/>
     <w:uiPriority w:val="62"/>
     <w:rsid w:val="00CB0664"/>
     <w:pPr>
@@ -3589,9 +3831,9 @@
       </w:tcPr>
     </w:tblStylePr>
   </w:style>
-  <w:style w:type="table" w:styleId="LightGrid-Accent5">
+  <w:style w:type="table" w:styleId="GradeClara-nfase5">
     <w:name w:val="Light Grid Accent 5"/>
-    <w:basedOn w:val="TableNormal"/>
+    <w:basedOn w:val="Tabelanormal"/>
     <w:uiPriority w:val="62"/>
     <w:rsid w:val="00CB0664"/>
     <w:pPr>
@@ -3719,9 +3961,9 @@
       </w:tcPr>
     </w:tblStylePr>
   </w:style>
-  <w:style w:type="table" w:styleId="LightGrid-Accent6">
+  <w:style w:type="table" w:styleId="GradeClara-nfase6">
     <w:name w:val="Light Grid Accent 6"/>
-    <w:basedOn w:val="TableNormal"/>
+    <w:basedOn w:val="Tabelanormal"/>
     <w:uiPriority w:val="62"/>
     <w:rsid w:val="00CB0664"/>
     <w:pPr>
@@ -3849,9 +4091,9 @@
       </w:tcPr>
     </w:tblStylePr>
   </w:style>
-  <w:style w:type="table" w:styleId="MediumShading1">
+  <w:style w:type="table" w:customStyle="1" w:styleId="SombreamentoMdio1">
     <w:name w:val="Medium Shading 1"/>
-    <w:basedOn w:val="TableNormal"/>
+    <w:basedOn w:val="Tabelanormal"/>
     <w:uiPriority w:val="63"/>
     <w:rsid w:val="00CB0664"/>
     <w:pPr>
@@ -3955,9 +4197,9 @@
       </w:tcPr>
     </w:tblStylePr>
   </w:style>
-  <w:style w:type="table" w:styleId="MediumShading1-Accent1">
+  <w:style w:type="table" w:customStyle="1" w:styleId="SombreamentoMdio1-nfase1">
     <w:name w:val="Medium Shading 1 Accent 1"/>
-    <w:basedOn w:val="TableNormal"/>
+    <w:basedOn w:val="Tabelanormal"/>
     <w:uiPriority w:val="63"/>
     <w:rsid w:val="00CB0664"/>
     <w:pPr>
@@ -4061,9 +4303,9 @@
       </w:tcPr>
     </w:tblStylePr>
   </w:style>
-  <w:style w:type="table" w:styleId="MediumShading1-Accent2">
+  <w:style w:type="table" w:styleId="SombreamentoMdio1-nfase2">
     <w:name w:val="Medium Shading 1 Accent 2"/>
-    <w:basedOn w:val="TableNormal"/>
+    <w:basedOn w:val="Tabelanormal"/>
     <w:uiPriority w:val="63"/>
     <w:rsid w:val="00CB0664"/>
     <w:pPr>
@@ -4167,9 +4409,9 @@
       </w:tcPr>
     </w:tblStylePr>
   </w:style>
-  <w:style w:type="table" w:styleId="MediumShading1-Accent3">
+  <w:style w:type="table" w:styleId="SombreamentoMdio1-nfase3">
     <w:name w:val="Medium Shading 1 Accent 3"/>
-    <w:basedOn w:val="TableNormal"/>
+    <w:basedOn w:val="Tabelanormal"/>
     <w:uiPriority w:val="63"/>
     <w:rsid w:val="00CB0664"/>
     <w:pPr>
@@ -4273,9 +4515,9 @@
       </w:tcPr>
     </w:tblStylePr>
   </w:style>
-  <w:style w:type="table" w:styleId="MediumShading1-Accent4">
+  <w:style w:type="table" w:styleId="SombreamentoMdio1-nfase4">
     <w:name w:val="Medium Shading 1 Accent 4"/>
-    <w:basedOn w:val="TableNormal"/>
+    <w:basedOn w:val="Tabelanormal"/>
     <w:uiPriority w:val="63"/>
     <w:rsid w:val="00CB0664"/>
     <w:pPr>
@@ -4379,9 +4621,9 @@
       </w:tcPr>
     </w:tblStylePr>
   </w:style>
-  <w:style w:type="table" w:styleId="MediumShading1-Accent5">
+  <w:style w:type="table" w:styleId="SombreamentoMdio1-nfase5">
     <w:name w:val="Medium Shading 1 Accent 5"/>
-    <w:basedOn w:val="TableNormal"/>
+    <w:basedOn w:val="Tabelanormal"/>
     <w:uiPriority w:val="63"/>
     <w:rsid w:val="00CB0664"/>
     <w:pPr>
@@ -4485,9 +4727,9 @@
       </w:tcPr>
     </w:tblStylePr>
   </w:style>
-  <w:style w:type="table" w:styleId="MediumShading1-Accent6">
+  <w:style w:type="table" w:styleId="SombreamentoMdio1-nfase6">
     <w:name w:val="Medium Shading 1 Accent 6"/>
-    <w:basedOn w:val="TableNormal"/>
+    <w:basedOn w:val="Tabelanormal"/>
     <w:uiPriority w:val="63"/>
     <w:rsid w:val="00CB0664"/>
     <w:pPr>
@@ -4591,9 +4833,9 @@
       </w:tcPr>
     </w:tblStylePr>
   </w:style>
-  <w:style w:type="table" w:styleId="MediumShading2">
+  <w:style w:type="table" w:customStyle="1" w:styleId="SombreamentoMdio2">
     <w:name w:val="Medium Shading 2"/>
-    <w:basedOn w:val="TableNormal"/>
+    <w:basedOn w:val="Tabelanormal"/>
     <w:uiPriority w:val="64"/>
     <w:rsid w:val="00CB0664"/>
     <w:pPr>
@@ -4740,9 +4982,9 @@
       </w:tcPr>
     </w:tblStylePr>
   </w:style>
-  <w:style w:type="table" w:styleId="MediumShading2-Accent1">
+  <w:style w:type="table" w:customStyle="1" w:styleId="SombreamentoMdio2-nfase1">
     <w:name w:val="Medium Shading 2 Accent 1"/>
-    <w:basedOn w:val="TableNormal"/>
+    <w:basedOn w:val="Tabelanormal"/>
     <w:uiPriority w:val="64"/>
     <w:rsid w:val="00CB0664"/>
     <w:pPr>
@@ -4889,9 +5131,9 @@
       </w:tcPr>
     </w:tblStylePr>
   </w:style>
-  <w:style w:type="table" w:styleId="MediumShading2-Accent2">
+  <w:style w:type="table" w:styleId="SombreamentoMdio2-nfase2">
     <w:name w:val="Medium Shading 2 Accent 2"/>
-    <w:basedOn w:val="TableNormal"/>
+    <w:basedOn w:val="Tabelanormal"/>
     <w:uiPriority w:val="64"/>
     <w:rsid w:val="00CB0664"/>
     <w:pPr>
@@ -5038,9 +5280,9 @@
       </w:tcPr>
     </w:tblStylePr>
   </w:style>
-  <w:style w:type="table" w:styleId="MediumShading2-Accent3">
+  <w:style w:type="table" w:styleId="SombreamentoMdio2-nfase3">
     <w:name w:val="Medium Shading 2 Accent 3"/>
-    <w:basedOn w:val="TableNormal"/>
+    <w:basedOn w:val="Tabelanormal"/>
     <w:uiPriority w:val="64"/>
     <w:rsid w:val="00CB0664"/>
     <w:pPr>
@@ -5187,9 +5429,9 @@
       </w:tcPr>
     </w:tblStylePr>
   </w:style>
-  <w:style w:type="table" w:styleId="MediumShading2-Accent4">
+  <w:style w:type="table" w:styleId="SombreamentoMdio2-nfase4">
     <w:name w:val="Medium Shading 2 Accent 4"/>
-    <w:basedOn w:val="TableNormal"/>
+    <w:basedOn w:val="Tabelanormal"/>
     <w:uiPriority w:val="64"/>
     <w:rsid w:val="00CB0664"/>
     <w:pPr>
@@ -5336,9 +5578,9 @@
       </w:tcPr>
     </w:tblStylePr>
   </w:style>
-  <w:style w:type="table" w:styleId="MediumShading2-Accent5">
+  <w:style w:type="table" w:styleId="SombreamentoMdio2-nfase5">
     <w:name w:val="Medium Shading 2 Accent 5"/>
-    <w:basedOn w:val="TableNormal"/>
+    <w:basedOn w:val="Tabelanormal"/>
     <w:uiPriority w:val="64"/>
     <w:rsid w:val="00CB0664"/>
     <w:pPr>
@@ -5485,9 +5727,9 @@
       </w:tcPr>
     </w:tblStylePr>
   </w:style>
-  <w:style w:type="table" w:styleId="MediumShading2-Accent6">
+  <w:style w:type="table" w:styleId="SombreamentoMdio2-nfase6">
     <w:name w:val="Medium Shading 2 Accent 6"/>
-    <w:basedOn w:val="TableNormal"/>
+    <w:basedOn w:val="Tabelanormal"/>
     <w:uiPriority w:val="64"/>
     <w:rsid w:val="00CB0664"/>
     <w:pPr>
@@ -5634,9 +5876,9 @@
       </w:tcPr>
     </w:tblStylePr>
   </w:style>
-  <w:style w:type="table" w:styleId="MediumList1">
+  <w:style w:type="table" w:customStyle="1" w:styleId="ListaMdia1">
     <w:name w:val="Medium List 1"/>
-    <w:basedOn w:val="TableNormal"/>
+    <w:basedOn w:val="Tabelanormal"/>
     <w:uiPriority w:val="65"/>
     <w:rsid w:val="00CB0664"/>
     <w:pPr>
@@ -5718,9 +5960,9 @@
       </w:tcPr>
     </w:tblStylePr>
   </w:style>
-  <w:style w:type="table" w:styleId="MediumList1-Accent1">
+  <w:style w:type="table" w:customStyle="1" w:styleId="ListaMdia1-nfase1">
     <w:name w:val="Medium List 1 Accent 1"/>
-    <w:basedOn w:val="TableNormal"/>
+    <w:basedOn w:val="Tabelanormal"/>
     <w:uiPriority w:val="65"/>
     <w:rsid w:val="00CB0664"/>
     <w:pPr>
@@ -5802,9 +6044,9 @@
       </w:tcPr>
     </w:tblStylePr>
   </w:style>
-  <w:style w:type="table" w:styleId="MediumList1-Accent2">
+  <w:style w:type="table" w:styleId="ListaMdia1-nfase2">
     <w:name w:val="Medium List 1 Accent 2"/>
-    <w:basedOn w:val="TableNormal"/>
+    <w:basedOn w:val="Tabelanormal"/>
     <w:uiPriority w:val="65"/>
     <w:rsid w:val="00CB0664"/>
     <w:pPr>
@@ -5886,9 +6128,9 @@
       </w:tcPr>
     </w:tblStylePr>
   </w:style>
-  <w:style w:type="table" w:styleId="MediumList1-Accent3">
+  <w:style w:type="table" w:styleId="ListaMdia1-nfase3">
     <w:name w:val="Medium List 1 Accent 3"/>
-    <w:basedOn w:val="TableNormal"/>
+    <w:basedOn w:val="Tabelanormal"/>
     <w:uiPriority w:val="65"/>
     <w:rsid w:val="00CB0664"/>
     <w:pPr>
@@ -5970,9 +6212,9 @@
       </w:tcPr>
     </w:tblStylePr>
   </w:style>
-  <w:style w:type="table" w:styleId="MediumList1-Accent4">
+  <w:style w:type="table" w:styleId="ListaMdia1-nfase4">
     <w:name w:val="Medium List 1 Accent 4"/>
-    <w:basedOn w:val="TableNormal"/>
+    <w:basedOn w:val="Tabelanormal"/>
     <w:uiPriority w:val="65"/>
     <w:rsid w:val="00CB0664"/>
     <w:pPr>
@@ -6054,9 +6296,9 @@
       </w:tcPr>
     </w:tblStylePr>
   </w:style>
-  <w:style w:type="table" w:styleId="MediumList1-Accent5">
+  <w:style w:type="table" w:styleId="ListaMdia1-nfase5">
     <w:name w:val="Medium List 1 Accent 5"/>
-    <w:basedOn w:val="TableNormal"/>
+    <w:basedOn w:val="Tabelanormal"/>
     <w:uiPriority w:val="65"/>
     <w:rsid w:val="00CB0664"/>
     <w:pPr>
@@ -6138,9 +6380,9 @@
       </w:tcPr>
     </w:tblStylePr>
   </w:style>
-  <w:style w:type="table" w:styleId="MediumList1-Accent6">
+  <w:style w:type="table" w:styleId="ListaMdia1-nfase6">
     <w:name w:val="Medium List 1 Accent 6"/>
-    <w:basedOn w:val="TableNormal"/>
+    <w:basedOn w:val="Tabelanormal"/>
     <w:uiPriority w:val="65"/>
     <w:rsid w:val="00CB0664"/>
     <w:pPr>
@@ -6222,9 +6464,9 @@
       </w:tcPr>
     </w:tblStylePr>
   </w:style>
-  <w:style w:type="table" w:styleId="MediumList2">
+  <w:style w:type="table" w:customStyle="1" w:styleId="ListaMdia2">
     <w:name w:val="Medium List 2"/>
-    <w:basedOn w:val="TableNormal"/>
+    <w:basedOn w:val="Tabelanormal"/>
     <w:uiPriority w:val="66"/>
     <w:rsid w:val="00CB0664"/>
     <w:pPr>
@@ -6350,9 +6592,9 @@
       </w:tcPr>
     </w:tblStylePr>
   </w:style>
-  <w:style w:type="table" w:styleId="MediumList2-Accent1">
+  <w:style w:type="table" w:styleId="ListaMdia2-nfase1">
     <w:name w:val="Medium List 2 Accent 1"/>
-    <w:basedOn w:val="TableNormal"/>
+    <w:basedOn w:val="Tabelanormal"/>
     <w:uiPriority w:val="66"/>
     <w:rsid w:val="00CB0664"/>
     <w:pPr>
@@ -6478,9 +6720,9 @@
       </w:tcPr>
     </w:tblStylePr>
   </w:style>
-  <w:style w:type="table" w:styleId="MediumList2-Accent2">
+  <w:style w:type="table" w:styleId="ListaMdia2-nfase2">
     <w:name w:val="Medium List 2 Accent 2"/>
-    <w:basedOn w:val="TableNormal"/>
+    <w:basedOn w:val="Tabelanormal"/>
     <w:uiPriority w:val="66"/>
     <w:rsid w:val="00CB0664"/>
     <w:pPr>
@@ -6606,9 +6848,9 @@
       </w:tcPr>
     </w:tblStylePr>
   </w:style>
-  <w:style w:type="table" w:styleId="MediumList2-Accent3">
+  <w:style w:type="table" w:styleId="ListaMdia2-nfase3">
     <w:name w:val="Medium List 2 Accent 3"/>
-    <w:basedOn w:val="TableNormal"/>
+    <w:basedOn w:val="Tabelanormal"/>
     <w:uiPriority w:val="66"/>
     <w:rsid w:val="00CB0664"/>
     <w:pPr>
@@ -6734,9 +6976,9 @@
       </w:tcPr>
     </w:tblStylePr>
   </w:style>
-  <w:style w:type="table" w:styleId="MediumList2-Accent4">
+  <w:style w:type="table" w:styleId="ListaMdia2-nfase4">
     <w:name w:val="Medium List 2 Accent 4"/>
-    <w:basedOn w:val="TableNormal"/>
+    <w:basedOn w:val="Tabelanormal"/>
     <w:uiPriority w:val="66"/>
     <w:rsid w:val="00CB0664"/>
     <w:pPr>
@@ -6862,9 +7104,9 @@
       </w:tcPr>
     </w:tblStylePr>
   </w:style>
-  <w:style w:type="table" w:styleId="MediumList2-Accent5">
+  <w:style w:type="table" w:styleId="ListaMdia2-nfase5">
     <w:name w:val="Medium List 2 Accent 5"/>
-    <w:basedOn w:val="TableNormal"/>
+    <w:basedOn w:val="Tabelanormal"/>
     <w:uiPriority w:val="66"/>
     <w:rsid w:val="00CB0664"/>
     <w:pPr>
@@ -6990,9 +7232,9 @@
       </w:tcPr>
     </w:tblStylePr>
   </w:style>
-  <w:style w:type="table" w:styleId="MediumList2-Accent6">
+  <w:style w:type="table" w:styleId="ListaMdia2-nfase6">
     <w:name w:val="Medium List 2 Accent 6"/>
-    <w:basedOn w:val="TableNormal"/>
+    <w:basedOn w:val="Tabelanormal"/>
     <w:uiPriority w:val="66"/>
     <w:rsid w:val="00CB0664"/>
     <w:pPr>
@@ -7118,9 +7360,9 @@
       </w:tcPr>
     </w:tblStylePr>
   </w:style>
-  <w:style w:type="table" w:styleId="MediumGrid1">
+  <w:style w:type="table" w:customStyle="1" w:styleId="GradeMdia1">
     <w:name w:val="Medium Grid 1"/>
-    <w:basedOn w:val="TableNormal"/>
+    <w:basedOn w:val="Tabelanormal"/>
     <w:uiPriority w:val="67"/>
     <w:rsid w:val="00CB0664"/>
     <w:pPr>
@@ -7191,9 +7433,9 @@
       </w:tcPr>
     </w:tblStylePr>
   </w:style>
-  <w:style w:type="table" w:styleId="MediumGrid1-Accent1">
+  <w:style w:type="table" w:styleId="GradeMdia1-nfase1">
     <w:name w:val="Medium Grid 1 Accent 1"/>
-    <w:basedOn w:val="TableNormal"/>
+    <w:basedOn w:val="Tabelanormal"/>
     <w:uiPriority w:val="67"/>
     <w:rsid w:val="00CB0664"/>
     <w:pPr>
@@ -7264,9 +7506,9 @@
       </w:tcPr>
     </w:tblStylePr>
   </w:style>
-  <w:style w:type="table" w:styleId="MediumGrid1-Accent2">
+  <w:style w:type="table" w:styleId="GradeMdia1-nfase2">
     <w:name w:val="Medium Grid 1 Accent 2"/>
-    <w:basedOn w:val="TableNormal"/>
+    <w:basedOn w:val="Tabelanormal"/>
     <w:uiPriority w:val="67"/>
     <w:rsid w:val="00CB0664"/>
     <w:pPr>
@@ -7337,9 +7579,9 @@
       </w:tcPr>
     </w:tblStylePr>
   </w:style>
-  <w:style w:type="table" w:styleId="MediumGrid1-Accent3">
+  <w:style w:type="table" w:styleId="GradeMdia1-nfase3">
     <w:name w:val="Medium Grid 1 Accent 3"/>
-    <w:basedOn w:val="TableNormal"/>
+    <w:basedOn w:val="Tabelanormal"/>
     <w:uiPriority w:val="67"/>
     <w:rsid w:val="00CB0664"/>
     <w:pPr>
@@ -7410,9 +7652,9 @@
       </w:tcPr>
     </w:tblStylePr>
   </w:style>
-  <w:style w:type="table" w:styleId="MediumGrid1-Accent4">
+  <w:style w:type="table" w:styleId="GradeMdia1-nfase4">
     <w:name w:val="Medium Grid 1 Accent 4"/>
-    <w:basedOn w:val="TableNormal"/>
+    <w:basedOn w:val="Tabelanormal"/>
     <w:uiPriority w:val="67"/>
     <w:rsid w:val="00CB0664"/>
     <w:pPr>
@@ -7483,9 +7725,9 @@
       </w:tcPr>
     </w:tblStylePr>
   </w:style>
-  <w:style w:type="table" w:styleId="MediumGrid1-Accent5">
+  <w:style w:type="table" w:styleId="GradeMdia1-nfase5">
     <w:name w:val="Medium Grid 1 Accent 5"/>
-    <w:basedOn w:val="TableNormal"/>
+    <w:basedOn w:val="Tabelanormal"/>
     <w:uiPriority w:val="67"/>
     <w:rsid w:val="00CB0664"/>
     <w:pPr>
@@ -7556,9 +7798,9 @@
       </w:tcPr>
     </w:tblStylePr>
   </w:style>
-  <w:style w:type="table" w:styleId="MediumGrid1-Accent6">
+  <w:style w:type="table" w:styleId="GradeMdia1-nfase6">
     <w:name w:val="Medium Grid 1 Accent 6"/>
-    <w:basedOn w:val="TableNormal"/>
+    <w:basedOn w:val="Tabelanormal"/>
     <w:uiPriority w:val="67"/>
     <w:rsid w:val="00CB0664"/>
     <w:pPr>
@@ -7629,9 +7871,9 @@
       </w:tcPr>
     </w:tblStylePr>
   </w:style>
-  <w:style w:type="table" w:styleId="MediumGrid2">
+  <w:style w:type="table" w:customStyle="1" w:styleId="GradeMdia2">
     <w:name w:val="Medium Grid 2"/>
-    <w:basedOn w:val="TableNormal"/>
+    <w:basedOn w:val="Tabelanormal"/>
     <w:uiPriority w:val="68"/>
     <w:rsid w:val="00CB0664"/>
     <w:pPr>
@@ -7754,9 +7996,9 @@
       </w:tcPr>
     </w:tblStylePr>
   </w:style>
-  <w:style w:type="table" w:styleId="MediumGrid2-Accent1">
+  <w:style w:type="table" w:styleId="GradeMdia2-nfase1">
     <w:name w:val="Medium Grid 2 Accent 1"/>
-    <w:basedOn w:val="TableNormal"/>
+    <w:basedOn w:val="Tabelanormal"/>
     <w:uiPriority w:val="68"/>
     <w:rsid w:val="00CB0664"/>
     <w:pPr>
@@ -7879,9 +8121,9 @@
       </w:tcPr>
     </w:tblStylePr>
   </w:style>
-  <w:style w:type="table" w:styleId="MediumGrid2-Accent2">
+  <w:style w:type="table" w:styleId="GradeMdia2-nfase2">
     <w:name w:val="Medium Grid 2 Accent 2"/>
-    <w:basedOn w:val="TableNormal"/>
+    <w:basedOn w:val="Tabelanormal"/>
     <w:uiPriority w:val="68"/>
     <w:rsid w:val="00CB0664"/>
     <w:pPr>
@@ -8004,9 +8246,9 @@
       </w:tcPr>
     </w:tblStylePr>
   </w:style>
-  <w:style w:type="table" w:styleId="MediumGrid2-Accent3">
+  <w:style w:type="table" w:styleId="GradeMdia2-nfase3">
     <w:name w:val="Medium Grid 2 Accent 3"/>
-    <w:basedOn w:val="TableNormal"/>
+    <w:basedOn w:val="Tabelanormal"/>
     <w:uiPriority w:val="68"/>
     <w:rsid w:val="00CB0664"/>
     <w:pPr>
@@ -8129,9 +8371,9 @@
       </w:tcPr>
     </w:tblStylePr>
   </w:style>
-  <w:style w:type="table" w:styleId="MediumGrid2-Accent4">
+  <w:style w:type="table" w:styleId="GradeMdia2-nfase4">
     <w:name w:val="Medium Grid 2 Accent 4"/>
-    <w:basedOn w:val="TableNormal"/>
+    <w:basedOn w:val="Tabelanormal"/>
     <w:uiPriority w:val="68"/>
     <w:rsid w:val="00CB0664"/>
     <w:pPr>
@@ -8254,9 +8496,9 @@
       </w:tcPr>
     </w:tblStylePr>
   </w:style>
-  <w:style w:type="table" w:styleId="MediumGrid2-Accent5">
+  <w:style w:type="table" w:styleId="GradeMdia2-nfase5">
     <w:name w:val="Medium Grid 2 Accent 5"/>
-    <w:basedOn w:val="TableNormal"/>
+    <w:basedOn w:val="Tabelanormal"/>
     <w:uiPriority w:val="68"/>
     <w:rsid w:val="00CB0664"/>
     <w:pPr>
@@ -8379,9 +8621,9 @@
       </w:tcPr>
     </w:tblStylePr>
   </w:style>
-  <w:style w:type="table" w:styleId="MediumGrid2-Accent6">
+  <w:style w:type="table" w:styleId="GradeMdia2-nfase6">
     <w:name w:val="Medium Grid 2 Accent 6"/>
-    <w:basedOn w:val="TableNormal"/>
+    <w:basedOn w:val="Tabelanormal"/>
     <w:uiPriority w:val="68"/>
     <w:rsid w:val="00CB0664"/>
     <w:pPr>
@@ -8504,9 +8746,9 @@
       </w:tcPr>
     </w:tblStylePr>
   </w:style>
-  <w:style w:type="table" w:styleId="MediumGrid3">
+  <w:style w:type="table" w:customStyle="1" w:styleId="GradeMdia3">
     <w:name w:val="Medium Grid 3"/>
-    <w:basedOn w:val="TableNormal"/>
+    <w:basedOn w:val="Tabelanormal"/>
     <w:uiPriority w:val="69"/>
     <w:rsid w:val="00CB0664"/>
     <w:pPr>
@@ -8645,9 +8887,9 @@
       </w:tcPr>
     </w:tblStylePr>
   </w:style>
-  <w:style w:type="table" w:styleId="MediumGrid3-Accent1">
+  <w:style w:type="table" w:styleId="GradeMdia3-nfase1">
     <w:name w:val="Medium Grid 3 Accent 1"/>
-    <w:basedOn w:val="TableNormal"/>
+    <w:basedOn w:val="Tabelanormal"/>
     <w:uiPriority w:val="69"/>
     <w:rsid w:val="00CB0664"/>
     <w:pPr>
@@ -8786,9 +9028,9 @@
       </w:tcPr>
     </w:tblStylePr>
   </w:style>
-  <w:style w:type="table" w:styleId="MediumGrid3-Accent2">
+  <w:style w:type="table" w:styleId="GradeMdia3-nfase2">
     <w:name w:val="Medium Grid 3 Accent 2"/>
-    <w:basedOn w:val="TableNormal"/>
+    <w:basedOn w:val="Tabelanormal"/>
     <w:uiPriority w:val="69"/>
     <w:rsid w:val="00CB0664"/>
     <w:pPr>
@@ -8927,9 +9169,9 @@
       </w:tcPr>
     </w:tblStylePr>
   </w:style>
-  <w:style w:type="table" w:styleId="MediumGrid3-Accent3">
+  <w:style w:type="table" w:styleId="GradeMdia3-nfase3">
     <w:name w:val="Medium Grid 3 Accent 3"/>
-    <w:basedOn w:val="TableNormal"/>
+    <w:basedOn w:val="Tabelanormal"/>
     <w:uiPriority w:val="69"/>
     <w:rsid w:val="00CB0664"/>
     <w:pPr>
@@ -9068,9 +9310,9 @@
       </w:tcPr>
     </w:tblStylePr>
   </w:style>
-  <w:style w:type="table" w:styleId="MediumGrid3-Accent4">
+  <w:style w:type="table" w:styleId="GradeMdia3-nfase4">
     <w:name w:val="Medium Grid 3 Accent 4"/>
-    <w:basedOn w:val="TableNormal"/>
+    <w:basedOn w:val="Tabelanormal"/>
     <w:uiPriority w:val="69"/>
     <w:rsid w:val="00CB0664"/>
     <w:pPr>
@@ -9209,9 +9451,9 @@
       </w:tcPr>
     </w:tblStylePr>
   </w:style>
-  <w:style w:type="table" w:styleId="MediumGrid3-Accent5">
+  <w:style w:type="table" w:styleId="GradeMdia3-nfase5">
     <w:name w:val="Medium Grid 3 Accent 5"/>
-    <w:basedOn w:val="TableNormal"/>
+    <w:basedOn w:val="Tabelanormal"/>
     <w:uiPriority w:val="69"/>
     <w:rsid w:val="00CB0664"/>
     <w:pPr>
@@ -9350,9 +9592,9 @@
       </w:tcPr>
     </w:tblStylePr>
   </w:style>
-  <w:style w:type="table" w:styleId="MediumGrid3-Accent6">
+  <w:style w:type="table" w:styleId="GradeMdia3-nfase6">
     <w:name w:val="Medium Grid 3 Accent 6"/>
-    <w:basedOn w:val="TableNormal"/>
+    <w:basedOn w:val="Tabelanormal"/>
     <w:uiPriority w:val="69"/>
     <w:rsid w:val="00CB0664"/>
     <w:pPr>
@@ -9491,9 +9733,9 @@
       </w:tcPr>
     </w:tblStylePr>
   </w:style>
-  <w:style w:type="table" w:styleId="DarkList">
+  <w:style w:type="table" w:customStyle="1" w:styleId="ListaEscura">
     <w:name w:val="Dark List"/>
-    <w:basedOn w:val="TableNormal"/>
+    <w:basedOn w:val="Tabelanormal"/>
     <w:uiPriority w:val="70"/>
     <w:rsid w:val="00CB0664"/>
     <w:pPr>
@@ -9605,9 +9847,9 @@
       </w:tcPr>
     </w:tblStylePr>
   </w:style>
-  <w:style w:type="table" w:styleId="DarkList-Accent1">
+  <w:style w:type="table" w:styleId="ListaEscura-nfase1">
     <w:name w:val="Dark List Accent 1"/>
-    <w:basedOn w:val="TableNormal"/>
+    <w:basedOn w:val="Tabelanormal"/>
     <w:uiPriority w:val="70"/>
     <w:rsid w:val="00CB0664"/>
     <w:pPr>
@@ -9719,9 +9961,9 @@
       </w:tcPr>
     </w:tblStylePr>
   </w:style>
-  <w:style w:type="table" w:styleId="DarkList-Accent2">
+  <w:style w:type="table" w:styleId="ListaEscura-nfase2">
     <w:name w:val="Dark List Accent 2"/>
-    <w:basedOn w:val="TableNormal"/>
+    <w:basedOn w:val="Tabelanormal"/>
     <w:uiPriority w:val="70"/>
     <w:rsid w:val="00CB0664"/>
     <w:pPr>
@@ -9833,9 +10075,9 @@
       </w:tcPr>
     </w:tblStylePr>
   </w:style>
-  <w:style w:type="table" w:styleId="DarkList-Accent3">
+  <w:style w:type="table" w:styleId="ListaEscura-nfase3">
     <w:name w:val="Dark List Accent 3"/>
-    <w:basedOn w:val="TableNormal"/>
+    <w:basedOn w:val="Tabelanormal"/>
     <w:uiPriority w:val="70"/>
     <w:rsid w:val="00CB0664"/>
     <w:pPr>
@@ -9947,9 +10189,9 @@
       </w:tcPr>
     </w:tblStylePr>
   </w:style>
-  <w:style w:type="table" w:styleId="DarkList-Accent4">
+  <w:style w:type="table" w:styleId="ListaEscura-nfase4">
     <w:name w:val="Dark List Accent 4"/>
-    <w:basedOn w:val="TableNormal"/>
+    <w:basedOn w:val="Tabelanormal"/>
     <w:uiPriority w:val="70"/>
     <w:rsid w:val="00CB0664"/>
     <w:pPr>
@@ -10061,9 +10303,9 @@
       </w:tcPr>
     </w:tblStylePr>
   </w:style>
-  <w:style w:type="table" w:styleId="DarkList-Accent5">
+  <w:style w:type="table" w:styleId="ListaEscura-nfase5">
     <w:name w:val="Dark List Accent 5"/>
-    <w:basedOn w:val="TableNormal"/>
+    <w:basedOn w:val="Tabelanormal"/>
     <w:uiPriority w:val="70"/>
     <w:rsid w:val="00CB0664"/>
     <w:pPr>
@@ -10175,9 +10417,9 @@
       </w:tcPr>
     </w:tblStylePr>
   </w:style>
-  <w:style w:type="table" w:styleId="DarkList-Accent6">
+  <w:style w:type="table" w:styleId="ListaEscura-nfase6">
     <w:name w:val="Dark List Accent 6"/>
-    <w:basedOn w:val="TableNormal"/>
+    <w:basedOn w:val="Tabelanormal"/>
     <w:uiPriority w:val="70"/>
     <w:rsid w:val="00CB0664"/>
     <w:pPr>
@@ -10289,9 +10531,9 @@
       </w:tcPr>
     </w:tblStylePr>
   </w:style>
-  <w:style w:type="table" w:styleId="ColorfulShading">
+  <w:style w:type="table" w:customStyle="1" w:styleId="SombreamentoColorido">
     <w:name w:val="Colorful Shading"/>
-    <w:basedOn w:val="TableNormal"/>
+    <w:basedOn w:val="Tabelanormal"/>
     <w:uiPriority w:val="71"/>
     <w:rsid w:val="00CB0664"/>
     <w:pPr>
@@ -10411,9 +10653,9 @@
       </w:rPr>
     </w:tblStylePr>
   </w:style>
-  <w:style w:type="table" w:styleId="ColorfulShading-Accent1">
+  <w:style w:type="table" w:styleId="SombreamentoEscuro-nfase1">
     <w:name w:val="Colorful Shading Accent 1"/>
-    <w:basedOn w:val="TableNormal"/>
+    <w:basedOn w:val="Tabelanormal"/>
     <w:uiPriority w:val="71"/>
     <w:rsid w:val="00CB0664"/>
     <w:pPr>
@@ -10533,9 +10775,9 @@
       </w:rPr>
     </w:tblStylePr>
   </w:style>
-  <w:style w:type="table" w:styleId="ColorfulShading-Accent2">
+  <w:style w:type="table" w:styleId="SombreamentoColorido-nfase2">
     <w:name w:val="Colorful Shading Accent 2"/>
-    <w:basedOn w:val="TableNormal"/>
+    <w:basedOn w:val="Tabelanormal"/>
     <w:uiPriority w:val="71"/>
     <w:rsid w:val="00CB0664"/>
     <w:pPr>
@@ -10655,9 +10897,9 @@
       </w:rPr>
     </w:tblStylePr>
   </w:style>
-  <w:style w:type="table" w:styleId="ColorfulShading-Accent3">
+  <w:style w:type="table" w:styleId="SombreamentoColorido-nfase3">
     <w:name w:val="Colorful Shading Accent 3"/>
-    <w:basedOn w:val="TableNormal"/>
+    <w:basedOn w:val="Tabelanormal"/>
     <w:uiPriority w:val="71"/>
     <w:rsid w:val="00CB0664"/>
     <w:pPr>
@@ -10767,9 +11009,9 @@
       </w:tcPr>
     </w:tblStylePr>
   </w:style>
-  <w:style w:type="table" w:styleId="ColorfulShading-Accent4">
+  <w:style w:type="table" w:styleId="SombreamentoColorido-nfase4">
     <w:name w:val="Colorful Shading Accent 4"/>
-    <w:basedOn w:val="TableNormal"/>
+    <w:basedOn w:val="Tabelanormal"/>
     <w:uiPriority w:val="71"/>
     <w:rsid w:val="00CB0664"/>
     <w:pPr>
@@ -10889,9 +11131,9 @@
       </w:rPr>
     </w:tblStylePr>
   </w:style>
-  <w:style w:type="table" w:styleId="ColorfulShading-Accent5">
+  <w:style w:type="table" w:styleId="SombreamentoColorido-nfase5">
     <w:name w:val="Colorful Shading Accent 5"/>
-    <w:basedOn w:val="TableNormal"/>
+    <w:basedOn w:val="Tabelanormal"/>
     <w:uiPriority w:val="71"/>
     <w:rsid w:val="00CB0664"/>
     <w:pPr>
@@ -11011,9 +11253,9 @@
       </w:rPr>
     </w:tblStylePr>
   </w:style>
-  <w:style w:type="table" w:styleId="ColorfulShading-Accent6">
+  <w:style w:type="table" w:styleId="SombreamentoColorido-nfase6">
     <w:name w:val="Colorful Shading Accent 6"/>
-    <w:basedOn w:val="TableNormal"/>
+    <w:basedOn w:val="Tabelanormal"/>
     <w:uiPriority w:val="71"/>
     <w:rsid w:val="00CB0664"/>
     <w:pPr>
@@ -11133,9 +11375,9 @@
       </w:rPr>
     </w:tblStylePr>
   </w:style>
-  <w:style w:type="table" w:styleId="ColorfulList">
+  <w:style w:type="table" w:customStyle="1" w:styleId="ListaColorida">
     <w:name w:val="Colorful List"/>
-    <w:basedOn w:val="TableNormal"/>
+    <w:basedOn w:val="Tabelanormal"/>
     <w:uiPriority w:val="72"/>
     <w:rsid w:val="00CB0664"/>
     <w:pPr>
@@ -11219,9 +11461,9 @@
       </w:tcPr>
     </w:tblStylePr>
   </w:style>
-  <w:style w:type="table" w:styleId="ColorfulList-Accent1">
+  <w:style w:type="table" w:styleId="ListaColorida-nfase1">
     <w:name w:val="Colorful List Accent 1"/>
-    <w:basedOn w:val="TableNormal"/>
+    <w:basedOn w:val="Tabelanormal"/>
     <w:uiPriority w:val="72"/>
     <w:rsid w:val="00CB0664"/>
     <w:pPr>
@@ -11305,9 +11547,9 @@
       </w:tcPr>
     </w:tblStylePr>
   </w:style>
-  <w:style w:type="table" w:styleId="ColorfulList-Accent2">
+  <w:style w:type="table" w:styleId="ListaColorida-nfase2">
     <w:name w:val="Colorful List Accent 2"/>
-    <w:basedOn w:val="TableNormal"/>
+    <w:basedOn w:val="Tabelanormal"/>
     <w:uiPriority w:val="72"/>
     <w:rsid w:val="00CB0664"/>
     <w:pPr>
@@ -11391,9 +11633,9 @@
       </w:tcPr>
     </w:tblStylePr>
   </w:style>
-  <w:style w:type="table" w:styleId="ColorfulList-Accent3">
+  <w:style w:type="table" w:styleId="ListaColorida-nfase3">
     <w:name w:val="Colorful List Accent 3"/>
-    <w:basedOn w:val="TableNormal"/>
+    <w:basedOn w:val="Tabelanormal"/>
     <w:uiPriority w:val="72"/>
     <w:rsid w:val="00CB0664"/>
     <w:pPr>
@@ -11477,9 +11719,9 @@
       </w:tcPr>
     </w:tblStylePr>
   </w:style>
-  <w:style w:type="table" w:styleId="ColorfulList-Accent4">
+  <w:style w:type="table" w:styleId="ListaColorida-nfase4">
     <w:name w:val="Colorful List Accent 4"/>
-    <w:basedOn w:val="TableNormal"/>
+    <w:basedOn w:val="Tabelanormal"/>
     <w:uiPriority w:val="72"/>
     <w:rsid w:val="00CB0664"/>
     <w:pPr>
@@ -11563,9 +11805,9 @@
       </w:tcPr>
     </w:tblStylePr>
   </w:style>
-  <w:style w:type="table" w:styleId="ColorfulList-Accent5">
+  <w:style w:type="table" w:styleId="ListaColorida-nfase5">
     <w:name w:val="Colorful List Accent 5"/>
-    <w:basedOn w:val="TableNormal"/>
+    <w:basedOn w:val="Tabelanormal"/>
     <w:uiPriority w:val="72"/>
     <w:rsid w:val="00CB0664"/>
     <w:pPr>
@@ -11649,9 +11891,9 @@
       </w:tcPr>
     </w:tblStylePr>
   </w:style>
-  <w:style w:type="table" w:styleId="ColorfulList-Accent6">
+  <w:style w:type="table" w:styleId="ListaColorida-nfase6">
     <w:name w:val="Colorful List Accent 6"/>
-    <w:basedOn w:val="TableNormal"/>
+    <w:basedOn w:val="Tabelanormal"/>
     <w:uiPriority w:val="72"/>
     <w:rsid w:val="00CB0664"/>
     <w:pPr>
@@ -11735,9 +11977,9 @@
       </w:tcPr>
     </w:tblStylePr>
   </w:style>
-  <w:style w:type="table" w:styleId="ColorfulGrid">
+  <w:style w:type="table" w:customStyle="1" w:styleId="GradeColorida">
     <w:name w:val="Colorful Grid"/>
-    <w:basedOn w:val="TableNormal"/>
+    <w:basedOn w:val="Tabelanormal"/>
     <w:uiPriority w:val="73"/>
     <w:rsid w:val="00CB0664"/>
     <w:pPr>
@@ -11815,9 +12057,9 @@
       </w:tcPr>
     </w:tblStylePr>
   </w:style>
-  <w:style w:type="table" w:styleId="ColorfulGrid-Accent1">
+  <w:style w:type="table" w:styleId="GradeColorida-nfase1">
     <w:name w:val="Colorful Grid Accent 1"/>
-    <w:basedOn w:val="TableNormal"/>
+    <w:basedOn w:val="Tabelanormal"/>
     <w:uiPriority w:val="73"/>
     <w:rsid w:val="00CB0664"/>
     <w:pPr>
@@ -11895,9 +12137,9 @@
       </w:tcPr>
     </w:tblStylePr>
   </w:style>
-  <w:style w:type="table" w:styleId="ColorfulGrid-Accent2">
+  <w:style w:type="table" w:styleId="GradeColorida-nfase2">
     <w:name w:val="Colorful Grid Accent 2"/>
-    <w:basedOn w:val="TableNormal"/>
+    <w:basedOn w:val="Tabelanormal"/>
     <w:uiPriority w:val="73"/>
     <w:rsid w:val="00CB0664"/>
     <w:pPr>
@@ -11975,9 +12217,9 @@
       </w:tcPr>
     </w:tblStylePr>
   </w:style>
-  <w:style w:type="table" w:styleId="ColorfulGrid-Accent3">
+  <w:style w:type="table" w:styleId="GradeColorida-nfase3">
     <w:name w:val="Colorful Grid Accent 3"/>
-    <w:basedOn w:val="TableNormal"/>
+    <w:basedOn w:val="Tabelanormal"/>
     <w:uiPriority w:val="73"/>
     <w:rsid w:val="00CB0664"/>
     <w:pPr>
@@ -12055,9 +12297,9 @@
       </w:tcPr>
     </w:tblStylePr>
   </w:style>
-  <w:style w:type="table" w:styleId="ColorfulGrid-Accent4">
+  <w:style w:type="table" w:styleId="GradeColorida-nfase4">
     <w:name w:val="Colorful Grid Accent 4"/>
-    <w:basedOn w:val="TableNormal"/>
+    <w:basedOn w:val="Tabelanormal"/>
     <w:uiPriority w:val="73"/>
     <w:rsid w:val="00CB0664"/>
     <w:pPr>
@@ -12135,9 +12377,9 @@
       </w:tcPr>
     </w:tblStylePr>
   </w:style>
-  <w:style w:type="table" w:styleId="ColorfulGrid-Accent5">
+  <w:style w:type="table" w:styleId="GradeColorida-nfase5">
     <w:name w:val="Colorful Grid Accent 5"/>
-    <w:basedOn w:val="TableNormal"/>
+    <w:basedOn w:val="Tabelanormal"/>
     <w:uiPriority w:val="73"/>
     <w:rsid w:val="00CB0664"/>
     <w:pPr>
@@ -12215,9 +12457,9 @@
       </w:tcPr>
     </w:tblStylePr>
   </w:style>
-  <w:style w:type="table" w:styleId="ColorfulGrid-Accent6">
+  <w:style w:type="table" w:styleId="GradeColorida-nfase6">
     <w:name w:val="Colorful Grid Accent 6"/>
-    <w:basedOn w:val="TableNormal"/>
+    <w:basedOn w:val="Tabelanormal"/>
     <w:uiPriority w:val="73"/>
     <w:rsid w:val="00CB0664"/>
     <w:pPr>
@@ -24425,7 +24667,7 @@
 </file>
 
 <file path=customXml/itemProps1.xml><?xml version="1.0" encoding="utf-8"?>
-<ds:datastoreItem xmlns:ds="http://schemas.openxmlformats.org/officeDocument/2006/customXml" ds:itemID="{EF278816-EC6F-A645-907D-7F25AECB1D4A}">
+<ds:datastoreItem xmlns:ds="http://schemas.openxmlformats.org/officeDocument/2006/customXml" ds:itemID="{F5C181FC-5A07-4680-91EB-4A0F9EF464D8}">
   <ds:schemaRefs>
     <ds:schemaRef ds:uri="http://schemas.openxmlformats.org/officeDocument/2006/bibliography"/>
   </ds:schemaRefs>

</xml_diff>